<commit_message>
Adjust GUI so that the default UI in all mode looks not bad..
</commit_message>
<xml_diff>
--- a/说明.docx
+++ b/说明.docx
@@ -1,10 +1,10 @@
 
 <file path=word/document.xml><?xml version="1.0" encoding="utf-8"?>
-<w:document xmlns:wpc="http://schemas.microsoft.com/office/word/2010/wordprocessingCanvas" xmlns:mc="http://schemas.openxmlformats.org/markup-compatibility/2006" xmlns:o="urn:schemas-microsoft-com:office:office" xmlns:r="http://schemas.openxmlformats.org/officeDocument/2006/relationships" xmlns:m="http://schemas.openxmlformats.org/officeDocument/2006/math" xmlns:v="urn:schemas-microsoft-com:vml" xmlns:wp14="http://schemas.microsoft.com/office/word/2010/wordprocessingDrawing" xmlns:wp="http://schemas.openxmlformats.org/drawingml/2006/wordprocessingDrawing" xmlns:w="http://schemas.openxmlformats.org/wordprocessingml/2006/main" xmlns:w14="http://schemas.microsoft.com/office/word/2010/wordml" xmlns:w10="urn:schemas-microsoft-com:office:word" xmlns:w15="http://schemas.microsoft.com/office/word/2012/wordml" xmlns:wpg="http://schemas.microsoft.com/office/word/2010/wordprocessingGroup" xmlns:wpi="http://schemas.microsoft.com/office/word/2010/wordprocessingInk" xmlns:wne="http://schemas.microsoft.com/office/word/2006/wordml" xmlns:wps="http://schemas.microsoft.com/office/word/2010/wordprocessingShape" xmlns:wpsCustomData="http://www.wps.cn/officeDocument/2013/wpsCustomData" mc:Ignorable="w14 w15 wp14">
+<w:document xmlns:wpc="http://schemas.microsoft.com/office/word/2010/wordprocessingCanvas" xmlns:cx="http://schemas.microsoft.com/office/drawing/2014/chartex" xmlns:cx1="http://schemas.microsoft.com/office/drawing/2015/9/8/chartex" xmlns:mc="http://schemas.openxmlformats.org/markup-compatibility/2006" xmlns:o="urn:schemas-microsoft-com:office:office" xmlns:r="http://schemas.openxmlformats.org/officeDocument/2006/relationships" xmlns:m="http://schemas.openxmlformats.org/officeDocument/2006/math" xmlns:v="urn:schemas-microsoft-com:vml" xmlns:wp14="http://schemas.microsoft.com/office/word/2010/wordprocessingDrawing" xmlns:wp="http://schemas.openxmlformats.org/drawingml/2006/wordprocessingDrawing" xmlns:w10="urn:schemas-microsoft-com:office:word" xmlns:w="http://schemas.openxmlformats.org/wordprocessingml/2006/main" xmlns:w14="http://schemas.microsoft.com/office/word/2010/wordml" xmlns:w15="http://schemas.microsoft.com/office/word/2012/wordml" xmlns:w16se="http://schemas.microsoft.com/office/word/2015/wordml/symex" xmlns:wpg="http://schemas.microsoft.com/office/word/2010/wordprocessingGroup" xmlns:wpi="http://schemas.microsoft.com/office/word/2010/wordprocessingInk" xmlns:wne="http://schemas.microsoft.com/office/word/2006/wordml" xmlns:wps="http://schemas.microsoft.com/office/word/2010/wordprocessingShape" mc:Ignorable="w14 w15 w16se wp14">
   <w:body>
     <w:p>
       <w:pPr>
-        <w:pStyle w:val="2"/>
+        <w:pStyle w:val="1"/>
         <w:rPr>
           <w:sz w:val="30"/>
           <w:szCs w:val="30"/>
@@ -21,7 +21,7 @@
     </w:p>
     <w:p>
       <w:pPr>
-        <w:ind w:firstLine="480" w:firstLineChars="200"/>
+        <w:ind w:firstLineChars="200" w:firstLine="480"/>
       </w:pPr>
       <w:r>
         <w:rPr>
@@ -32,7 +32,7 @@
     </w:p>
     <w:p>
       <w:pPr>
-        <w:pStyle w:val="22"/>
+        <w:pStyle w:val="a3"/>
         <w:numPr>
           <w:ilvl w:val="0"/>
           <w:numId w:val="3"/>
@@ -51,10 +51,13 @@
         <w:jc w:val="center"/>
       </w:pPr>
       <w:r>
+        <w:rPr>
+          <w:noProof/>
+        </w:rPr>
         <w:drawing>
-          <wp:inline distT="0" distB="0" distL="0" distR="0">
-            <wp:extent cx="3906520" cy="3484245"/>
-            <wp:effectExtent l="0" t="0" r="0" b="1905"/>
+          <wp:inline distT="0" distB="0" distL="0" distR="0" wp14:anchorId="3754F439" wp14:editId="4891760F">
+            <wp:extent cx="4810351" cy="4439121"/>
+            <wp:effectExtent l="0" t="0" r="0" b="0"/>
             <wp:docPr id="1" name="图片 1"/>
             <wp:cNvGraphicFramePr>
               <a:graphicFrameLocks xmlns:a="http://schemas.openxmlformats.org/drawingml/2006/main" noChangeAspect="1"/>
@@ -63,20 +66,11 @@
               <a:graphicData uri="http://schemas.openxmlformats.org/drawingml/2006/picture">
                 <pic:pic xmlns:pic="http://schemas.openxmlformats.org/drawingml/2006/picture">
                   <pic:nvPicPr>
-                    <pic:cNvPr id="1" name="图片 1"/>
-                    <pic:cNvPicPr>
-                      <a:picLocks noChangeAspect="1" noChangeArrowheads="1"/>
-                    </pic:cNvPicPr>
+                    <pic:cNvPr id="1" name=""/>
+                    <pic:cNvPicPr/>
                   </pic:nvPicPr>
                   <pic:blipFill>
-                    <a:blip r:embed="rId6">
-                      <a:extLst>
-                        <a:ext uri="{28A0092B-C50C-407E-A947-70E740481C1C}">
-                          <a14:useLocalDpi xmlns:a14="http://schemas.microsoft.com/office/drawing/2010/main" val="0"/>
-                        </a:ext>
-                      </a:extLst>
-                    </a:blip>
-                    <a:srcRect/>
+                    <a:blip r:embed="rId7"/>
                     <a:stretch>
                       <a:fillRect/>
                     </a:stretch>
@@ -84,15 +78,11 @@
                   <pic:spPr>
                     <a:xfrm>
                       <a:off x="0" y="0"/>
-                      <a:ext cx="3908352" cy="3485629"/>
+                      <a:ext cx="4812385" cy="4440998"/>
                     </a:xfrm>
                     <a:prstGeom prst="rect">
                       <a:avLst/>
                     </a:prstGeom>
-                    <a:noFill/>
-                    <a:ln>
-                      <a:noFill/>
-                    </a:ln>
                   </pic:spPr>
                 </pic:pic>
               </a:graphicData>
@@ -103,13 +93,19 @@
     </w:p>
     <w:p>
       <w:pPr>
-        <w:ind w:firstLine="480" w:firstLineChars="200"/>
-      </w:pPr>
-      <w:r>
-        <w:rPr>
-          <w:rFonts w:hint="eastAsia"/>
-        </w:rPr>
-        <w:t>“扫描能谱”模式按照设定的能谱范围和步进进行扫描，并保存每一步长能区范围的数据。每一像素的数据是“设置帧大小”中数量的数据的累加。数据存储位置同上。数据保存格式为.</w:t>
+        <w:ind w:firstLineChars="200" w:firstLine="480"/>
+      </w:pPr>
+      <w:r>
+        <w:rPr>
+          <w:rFonts w:hint="eastAsia"/>
+        </w:rPr>
+        <w:t>“扫描能谱”模式按照设定的能谱范围和步进进行扫描，并保存每一步长能区范围的数据。每一像素的数据是“设置帧大小”中数量的数据的累加。数据存储位置同上。数据保存格式为</w:t>
+      </w:r>
+      <w:r>
+        <w:rPr>
+          <w:rFonts w:hint="eastAsia"/>
+        </w:rPr>
+        <w:t>.</w:t>
       </w:r>
       <w:r>
         <w:t>csv</w:t>
@@ -126,6 +122,10 @@
         <w:jc w:val="center"/>
       </w:pPr>
       <w:r>
+        <w:rPr>
+          <w:noProof/>
+        </w:rPr>
+        <w:lastRenderedPageBreak/>
         <w:drawing>
           <wp:inline distT="0" distB="0" distL="0" distR="0">
             <wp:extent cx="4775200" cy="2753995"/>
@@ -144,7 +144,7 @@
                     </pic:cNvPicPr>
                   </pic:nvPicPr>
                   <pic:blipFill>
-                    <a:blip r:embed="rId7"/>
+                    <a:blip r:embed="rId8"/>
                     <a:stretch>
                       <a:fillRect/>
                     </a:stretch>
@@ -167,13 +167,19 @@
     </w:p>
     <w:p>
       <w:pPr>
-        <w:ind w:firstLine="480" w:firstLineChars="200"/>
-      </w:pPr>
-      <w:r>
-        <w:rPr>
-          <w:rFonts w:hint="eastAsia"/>
-        </w:rPr>
-        <w:t>在“扫描能谱”模式下，点击“图像保存”按钮保持的.</w:t>
+        <w:ind w:firstLineChars="200" w:firstLine="480"/>
+      </w:pPr>
+      <w:r>
+        <w:rPr>
+          <w:rFonts w:hint="eastAsia"/>
+        </w:rPr>
+        <w:t>在“扫描能谱”模式下，点击“图像保存”按钮保持的</w:t>
+      </w:r>
+      <w:r>
+        <w:rPr>
+          <w:rFonts w:hint="eastAsia"/>
+        </w:rPr>
+        <w:t>.</w:t>
       </w:r>
       <w:r>
         <w:t>raw</w:t>
@@ -182,17 +188,25 @@
         <w:rPr>
           <w:rFonts w:hint="eastAsia"/>
         </w:rPr>
-        <w:t>文件，只有第3个文件的内容是有意义的，它按能谱扫描的顺序保存了所有从探测器读到的原始数据。</w:t>
+        <w:t>文件，只有第</w:t>
+      </w:r>
+      <w:r>
+        <w:rPr>
+          <w:rFonts w:hint="eastAsia"/>
+        </w:rPr>
+        <w:t>3</w:t>
+      </w:r>
+      <w:r>
+        <w:rPr>
+          <w:rFonts w:hint="eastAsia"/>
+        </w:rPr>
+        <w:t>个文件的内容是有意义的，它按能谱扫描的顺序保存了所有从探测器读到的原始数据。</w:t>
       </w:r>
     </w:p>
+    <w:p/>
     <w:p>
       <w:pPr>
-        <w:jc w:val="both"/>
-      </w:pPr>
-    </w:p>
-    <w:p>
-      <w:pPr>
-        <w:pStyle w:val="22"/>
+        <w:pStyle w:val="a3"/>
         <w:numPr>
           <w:ilvl w:val="0"/>
           <w:numId w:val="3"/>
@@ -203,7 +217,19 @@
         <w:rPr>
           <w:rFonts w:hint="eastAsia"/>
         </w:rPr>
-        <w:t>“手动/定时扫描”模式</w:t>
+        <w:t>“手动</w:t>
+      </w:r>
+      <w:r>
+        <w:rPr>
+          <w:rFonts w:hint="eastAsia"/>
+        </w:rPr>
+        <w:t>/</w:t>
+      </w:r>
+      <w:r>
+        <w:rPr>
+          <w:rFonts w:hint="eastAsia"/>
+        </w:rPr>
+        <w:t>定时扫描”模式</w:t>
       </w:r>
     </w:p>
     <w:p>
@@ -211,11 +237,14 @@
         <w:jc w:val="center"/>
       </w:pPr>
       <w:r>
+        <w:rPr>
+          <w:noProof/>
+        </w:rPr>
         <w:drawing>
-          <wp:inline distT="0" distB="0" distL="0" distR="0">
-            <wp:extent cx="3883025" cy="3457575"/>
-            <wp:effectExtent l="0" t="0" r="3175" b="9525"/>
-            <wp:docPr id="2" name="图片 2"/>
+          <wp:inline distT="0" distB="0" distL="0" distR="0" wp14:anchorId="3A9CF444" wp14:editId="73A2C202">
+            <wp:extent cx="4714843" cy="4350984"/>
+            <wp:effectExtent l="0" t="0" r="0" b="0"/>
+            <wp:docPr id="6" name="图片 6"/>
             <wp:cNvGraphicFramePr>
               <a:graphicFrameLocks xmlns:a="http://schemas.openxmlformats.org/drawingml/2006/main" noChangeAspect="1"/>
             </wp:cNvGraphicFramePr>
@@ -223,13 +252,11 @@
               <a:graphicData uri="http://schemas.openxmlformats.org/drawingml/2006/picture">
                 <pic:pic xmlns:pic="http://schemas.openxmlformats.org/drawingml/2006/picture">
                   <pic:nvPicPr>
-                    <pic:cNvPr id="2" name="图片 2"/>
-                    <pic:cNvPicPr>
-                      <a:picLocks noChangeAspect="1"/>
-                    </pic:cNvPicPr>
+                    <pic:cNvPr id="1" name=""/>
+                    <pic:cNvPicPr/>
                   </pic:nvPicPr>
                   <pic:blipFill>
-                    <a:blip r:embed="rId8"/>
+                    <a:blip r:embed="rId9"/>
                     <a:stretch>
                       <a:fillRect/>
                     </a:stretch>
@@ -237,7 +264,7 @@
                   <pic:spPr>
                     <a:xfrm>
                       <a:off x="0" y="0"/>
-                      <a:ext cx="3890746" cy="3464478"/>
+                      <a:ext cx="4719050" cy="4354867"/>
                     </a:xfrm>
                     <a:prstGeom prst="rect">
                       <a:avLst/>
@@ -252,13 +279,32 @@
     </w:p>
     <w:p>
       <w:pPr>
-        <w:ind w:firstLine="480" w:firstLineChars="200"/>
-      </w:pPr>
-      <w:r>
-        <w:rPr>
-          <w:rFonts w:hint="eastAsia"/>
-        </w:rPr>
-        <w:t>“手动/定时扫描”与原d</w:t>
+        <w:ind w:firstLineChars="200" w:firstLine="480"/>
+      </w:pPr>
+      <w:r>
+        <w:rPr>
+          <w:rFonts w:hint="eastAsia"/>
+        </w:rPr>
+        <w:lastRenderedPageBreak/>
+        <w:t>“手动</w:t>
+      </w:r>
+      <w:r>
+        <w:rPr>
+          <w:rFonts w:hint="eastAsia"/>
+        </w:rPr>
+        <w:t>/</w:t>
+      </w:r>
+      <w:r>
+        <w:rPr>
+          <w:rFonts w:hint="eastAsia"/>
+        </w:rPr>
+        <w:t>定时扫描”与原</w:t>
+      </w:r>
+      <w:r>
+        <w:rPr>
+          <w:rFonts w:hint="eastAsia"/>
+        </w:rPr>
+        <w:t>d</w:t>
       </w:r>
       <w:r>
         <w:t>emo</w:t>
@@ -267,7 +313,13 @@
         <w:rPr>
           <w:rFonts w:hint="eastAsia"/>
         </w:rPr>
-        <w:t>程序的功能相同，只是修改了“图像保存”的位置。现在的位置在当前目录下的“.</w:t>
+        <w:t>程序的功能相同，只是修改了“图像保存”的位置。现在的位置在当前目录下的“</w:t>
+      </w:r>
+      <w:r>
+        <w:rPr>
+          <w:rFonts w:hint="eastAsia"/>
+        </w:rPr>
+        <w:t>.</w:t>
       </w:r>
       <w:r>
         <w:t>/scan_result</w:t>
@@ -276,7 +328,13 @@
         <w:rPr>
           <w:rFonts w:hint="eastAsia"/>
         </w:rPr>
-        <w:t>”中。该模式下，“开始扫描”之后，内部有一个1</w:t>
+        <w:t>”中。该模式下，“开始扫描”之后，内部有一个</w:t>
+      </w:r>
+      <w:r>
+        <w:rPr>
+          <w:rFonts w:hint="eastAsia"/>
+        </w:rPr>
+        <w:t>1</w:t>
       </w:r>
       <w:r>
         <w:t>0s</w:t>
@@ -290,16 +348,13 @@
     </w:p>
     <w:p>
       <w:pPr>
-        <w:pStyle w:val="22"/>
-        <w:numPr>
-          <w:numId w:val="0"/>
-        </w:numPr>
-        <w:ind w:leftChars="0"/>
+        <w:pStyle w:val="a3"/>
+        <w:ind w:firstLineChars="0" w:firstLine="0"/>
       </w:pPr>
     </w:p>
     <w:p>
       <w:pPr>
-        <w:pStyle w:val="22"/>
+        <w:pStyle w:val="a3"/>
         <w:numPr>
           <w:ilvl w:val="0"/>
           <w:numId w:val="3"/>
@@ -315,17 +370,17 @@
     </w:p>
     <w:p>
       <w:pPr>
-        <w:ind w:firstLine="480" w:firstLineChars="200"/>
-        <w:rPr>
-          <w:rFonts w:hint="eastAsia"/>
-        </w:rPr>
-      </w:pPr>
-      <w:r>
+        <w:ind w:firstLineChars="200" w:firstLine="480"/>
+      </w:pPr>
+      <w:r>
+        <w:rPr>
+          <w:noProof/>
+        </w:rPr>
         <w:drawing>
-          <wp:inline distT="0" distB="0" distL="114300" distR="114300">
-            <wp:extent cx="5272405" cy="4705350"/>
-            <wp:effectExtent l="0" t="0" r="635" b="3810"/>
-            <wp:docPr id="5" name="图片 1"/>
+          <wp:inline distT="0" distB="0" distL="0" distR="0" wp14:anchorId="12447E5D" wp14:editId="49563BE6">
+            <wp:extent cx="4738323" cy="4372652"/>
+            <wp:effectExtent l="0" t="0" r="5715" b="8890"/>
+            <wp:docPr id="7" name="图片 7"/>
             <wp:cNvGraphicFramePr>
               <a:graphicFrameLocks xmlns:a="http://schemas.openxmlformats.org/drawingml/2006/main" noChangeAspect="1"/>
             </wp:cNvGraphicFramePr>
@@ -333,13 +388,11 @@
               <a:graphicData uri="http://schemas.openxmlformats.org/drawingml/2006/picture">
                 <pic:pic xmlns:pic="http://schemas.openxmlformats.org/drawingml/2006/picture">
                   <pic:nvPicPr>
-                    <pic:cNvPr id="5" name="图片 1"/>
-                    <pic:cNvPicPr>
-                      <a:picLocks noChangeAspect="1"/>
-                    </pic:cNvPicPr>
+                    <pic:cNvPr id="1" name=""/>
+                    <pic:cNvPicPr/>
                   </pic:nvPicPr>
                   <pic:blipFill>
-                    <a:blip r:embed="rId9"/>
+                    <a:blip r:embed="rId10"/>
                     <a:stretch>
                       <a:fillRect/>
                     </a:stretch>
@@ -347,15 +400,11 @@
                   <pic:spPr>
                     <a:xfrm>
                       <a:off x="0" y="0"/>
-                      <a:ext cx="5272405" cy="4705350"/>
+                      <a:ext cx="4741360" cy="4375455"/>
                     </a:xfrm>
                     <a:prstGeom prst="rect">
                       <a:avLst/>
                     </a:prstGeom>
-                    <a:noFill/>
-                    <a:ln>
-                      <a:noFill/>
-                    </a:ln>
                   </pic:spPr>
                 </pic:pic>
               </a:graphicData>
@@ -366,13 +415,19 @@
     </w:p>
     <w:p>
       <w:pPr>
-        <w:ind w:firstLine="480" w:firstLineChars="200"/>
-      </w:pPr>
-      <w:r>
-        <w:rPr>
-          <w:rFonts w:hint="eastAsia"/>
-        </w:rPr>
-        <w:t>除非出错或者手动停止，否则不会停止扫描。扫描结果保存在前目录下的“.</w:t>
+        <w:ind w:firstLineChars="200" w:firstLine="480"/>
+      </w:pPr>
+      <w:r>
+        <w:rPr>
+          <w:rFonts w:hint="eastAsia"/>
+        </w:rPr>
+        <w:t>除非出错或者手动停止，否则不会停止扫描。扫描结果保存在前目录下的“</w:t>
+      </w:r>
+      <w:r>
+        <w:rPr>
+          <w:rFonts w:hint="eastAsia"/>
+        </w:rPr>
+        <w:t>.</w:t>
       </w:r>
       <w:r>
         <w:t>/scan_result/ infinite_scan</w:t>
@@ -381,7 +436,13 @@
         <w:rPr>
           <w:rFonts w:hint="eastAsia"/>
         </w:rPr>
-        <w:t xml:space="preserve">”下，每次扫描新建一个文件夹。扫描结果分段保存：每收到（设置帧数量 </w:t>
+        <w:t>”下，每次扫描新建一个文件夹。扫描结果分段保存：每收到（设置帧数量</w:t>
+      </w:r>
+      <w:r>
+        <w:rPr>
+          <w:rFonts w:hint="eastAsia"/>
+        </w:rPr>
+        <w:t xml:space="preserve"> </w:t>
       </w:r>
       <w:r>
         <w:t xml:space="preserve">* </w:t>
@@ -390,7 +451,37 @@
         <w:rPr>
           <w:rFonts w:hint="eastAsia"/>
         </w:rPr>
-        <w:t>扫描频率）个帧，保存一次，一次3个能区的数据存在3个文件中，分别以“-</w:t>
+        <w:t>扫描频率）个帧，保存一次，一次</w:t>
+      </w:r>
+      <w:r>
+        <w:rPr>
+          <w:rFonts w:hint="eastAsia"/>
+        </w:rPr>
+        <w:t>3</w:t>
+      </w:r>
+      <w:r>
+        <w:rPr>
+          <w:rFonts w:hint="eastAsia"/>
+        </w:rPr>
+        <w:t>个能区的数据存在</w:t>
+      </w:r>
+      <w:r>
+        <w:rPr>
+          <w:rFonts w:hint="eastAsia"/>
+        </w:rPr>
+        <w:t>3</w:t>
+      </w:r>
+      <w:r>
+        <w:rPr>
+          <w:rFonts w:hint="eastAsia"/>
+        </w:rPr>
+        <w:t>个文件中，分别以“</w:t>
+      </w:r>
+      <w:r>
+        <w:rPr>
+          <w:rFonts w:hint="eastAsia"/>
+        </w:rPr>
+        <w:t>-</w:t>
       </w:r>
       <w:r>
         <w:t>1/2/3</w:t>
@@ -404,31 +495,52 @@
     </w:p>
     <w:p>
       <w:pPr>
-        <w:ind w:firstLine="480" w:firstLineChars="200"/>
-      </w:pPr>
+        <w:ind w:firstLineChars="200" w:firstLine="480"/>
+        <w:rPr>
+          <w:rFonts w:hint="eastAsia"/>
+        </w:rPr>
+      </w:pPr>
+      <w:r>
+        <w:rPr>
+          <w:rFonts w:hint="eastAsia"/>
+        </w:rPr>
+        <w:t>如果勾选“保存所有”，所有扫描数据都会被保存（数据量会很大</w:t>
+      </w:r>
+      <w:bookmarkStart w:id="0" w:name="_GoBack"/>
+      <w:bookmarkEnd w:id="0"/>
+      <w:r>
+        <w:rPr>
+          <w:rFonts w:hint="eastAsia"/>
+        </w:rPr>
+        <w:t>）；否则，以“间隔保存”为周期保存数据。</w:t>
+      </w:r>
     </w:p>
     <w:p>
       <w:pPr>
-        <w:pStyle w:val="2"/>
+        <w:ind w:firstLineChars="200" w:firstLine="480"/>
+      </w:pPr>
+    </w:p>
+    <w:p>
+      <w:pPr>
+        <w:pStyle w:val="1"/>
         <w:rPr>
           <w:sz w:val="30"/>
           <w:szCs w:val="30"/>
         </w:rPr>
       </w:pPr>
-      <w:bookmarkStart w:id="0" w:name="_GoBack"/>
-      <w:bookmarkEnd w:id="0"/>
       <w:r>
         <w:rPr>
           <w:rFonts w:hint="eastAsia"/>
           <w:sz w:val="30"/>
           <w:szCs w:val="30"/>
         </w:rPr>
+        <w:lastRenderedPageBreak/>
         <w:t>注意事项</w:t>
       </w:r>
     </w:p>
     <w:p>
       <w:pPr>
-        <w:pStyle w:val="22"/>
+        <w:pStyle w:val="a3"/>
         <w:numPr>
           <w:ilvl w:val="0"/>
           <w:numId w:val="4"/>
@@ -439,12 +551,48 @@
         <w:rPr>
           <w:rFonts w:hint="eastAsia"/>
         </w:rPr>
-        <w:t>探测器有3个能区，设置能区阈值时，需满足“靠后的能区阈值不低于靠前的值”这一规则，否则会设置失败。有时候，如果手动调整了探测器能区阈值，可能导致“扫描能谱”模式工作时，在准备阶段设置的目标阈值违反上述规则、无法设置成功。此时可以切换到“手动/定时扫描”模式，手动将3个阈值都设置为“扫描能谱”模式中的最低阈值，再回到“扫描能谱”模式，即可正常使用。</w:t>
+        <w:t>探测器有</w:t>
+      </w:r>
+      <w:r>
+        <w:rPr>
+          <w:rFonts w:hint="eastAsia"/>
+        </w:rPr>
+        <w:t>3</w:t>
+      </w:r>
+      <w:r>
+        <w:rPr>
+          <w:rFonts w:hint="eastAsia"/>
+        </w:rPr>
+        <w:t>个能区，设置能区阈值时，需满足“靠后的能区阈值不低于靠前的值”这一规则，否则会设置失败。有时候，如果手动调整了探测器能区阈值，可能导致“扫描能谱”模式工作时，在准备阶段设置的目标阈值违反上述规则、无法设置成功。此时可以切换到“手动</w:t>
+      </w:r>
+      <w:r>
+        <w:rPr>
+          <w:rFonts w:hint="eastAsia"/>
+        </w:rPr>
+        <w:t>/</w:t>
+      </w:r>
+      <w:r>
+        <w:rPr>
+          <w:rFonts w:hint="eastAsia"/>
+        </w:rPr>
+        <w:t>定时扫描”模式，手动将</w:t>
+      </w:r>
+      <w:r>
+        <w:rPr>
+          <w:rFonts w:hint="eastAsia"/>
+        </w:rPr>
+        <w:t>3</w:t>
+      </w:r>
+      <w:r>
+        <w:rPr>
+          <w:rFonts w:hint="eastAsia"/>
+        </w:rPr>
+        <w:t>个阈值都设置为“扫描能谱”模式中的最低阈值，再回到“扫描能谱”模式，即可正常使用。</w:t>
       </w:r>
     </w:p>
     <w:p>
       <w:pPr>
-        <w:pStyle w:val="22"/>
+        <w:pStyle w:val="a3"/>
         <w:numPr>
           <w:ilvl w:val="0"/>
           <w:numId w:val="4"/>
@@ -455,7 +603,13 @@
         <w:rPr>
           <w:rFonts w:hint="eastAsia"/>
         </w:rPr>
-        <w:t>运行程序的P</w:t>
+        <w:t>运行程序的</w:t>
+      </w:r>
+      <w:r>
+        <w:rPr>
+          <w:rFonts w:hint="eastAsia"/>
+        </w:rPr>
+        <w:t>P</w:t>
       </w:r>
       <w:r>
         <w:t>C</w:t>
@@ -464,7 +618,13 @@
         <w:rPr>
           <w:rFonts w:hint="eastAsia"/>
         </w:rPr>
-        <w:t>，需要将网卡设置为静态I</w:t>
+        <w:t>，需要将网卡设置为静态</w:t>
+      </w:r>
+      <w:r>
+        <w:rPr>
+          <w:rFonts w:hint="eastAsia"/>
+        </w:rPr>
+        <w:t>I</w:t>
       </w:r>
       <w:r>
         <w:t>P</w:t>
@@ -473,7 +633,13 @@
         <w:rPr>
           <w:rFonts w:hint="eastAsia"/>
         </w:rPr>
-        <w:t>地址1</w:t>
+        <w:t>地址</w:t>
+      </w:r>
+      <w:r>
+        <w:rPr>
+          <w:rFonts w:hint="eastAsia"/>
+        </w:rPr>
+        <w:t>1</w:t>
       </w:r>
       <w:r>
         <w:t>92.168.1.110</w:t>
@@ -482,7 +648,13 @@
         <w:rPr>
           <w:rFonts w:hint="eastAsia"/>
         </w:rPr>
-        <w:t>，子网掩码2</w:t>
+        <w:t>，子网掩码</w:t>
+      </w:r>
+      <w:r>
+        <w:rPr>
+          <w:rFonts w:hint="eastAsia"/>
+        </w:rPr>
+        <w:t>2</w:t>
       </w:r>
       <w:r>
         <w:t>55.255.255.0</w:t>
@@ -491,7 +663,13 @@
         <w:rPr>
           <w:rFonts w:hint="eastAsia"/>
         </w:rPr>
-        <w:t>。探测器的网络层设置比较简陋：初始化时，P</w:t>
+        <w:t>。探测器的网络层设置比较简陋：初始化时，</w:t>
+      </w:r>
+      <w:r>
+        <w:rPr>
+          <w:rFonts w:hint="eastAsia"/>
+        </w:rPr>
+        <w:t>P</w:t>
       </w:r>
       <w:r>
         <w:t>C</w:t>
@@ -500,7 +678,19 @@
         <w:rPr>
           <w:rFonts w:hint="eastAsia"/>
         </w:rPr>
-        <w:t>端探测器库函数发送I</w:t>
+        <w:t>端探测器库</w:t>
+      </w:r>
+      <w:r>
+        <w:rPr>
+          <w:rFonts w:hint="eastAsia"/>
+        </w:rPr>
+        <w:t>函数发送</w:t>
+      </w:r>
+      <w:r>
+        <w:rPr>
+          <w:rFonts w:hint="eastAsia"/>
+        </w:rPr>
+        <w:t>I</w:t>
       </w:r>
       <w:r>
         <w:t>P</w:t>
@@ -509,7 +699,13 @@
         <w:rPr>
           <w:rFonts w:hint="eastAsia"/>
         </w:rPr>
-        <w:t>地址为2</w:t>
+        <w:t>地址为</w:t>
+      </w:r>
+      <w:r>
+        <w:rPr>
+          <w:rFonts w:hint="eastAsia"/>
+        </w:rPr>
+        <w:t>2</w:t>
       </w:r>
       <w:r>
         <w:t>55.255.255.255</w:t>
@@ -518,7 +714,13 @@
         <w:rPr>
           <w:rFonts w:hint="eastAsia"/>
         </w:rPr>
-        <w:t>的受限I</w:t>
+        <w:t>的受限</w:t>
+      </w:r>
+      <w:r>
+        <w:rPr>
+          <w:rFonts w:hint="eastAsia"/>
+        </w:rPr>
+        <w:t>I</w:t>
       </w:r>
       <w:r>
         <w:t>P</w:t>
@@ -527,7 +729,13 @@
         <w:rPr>
           <w:rFonts w:hint="eastAsia"/>
         </w:rPr>
-        <w:t>层广播，而不是子网广播，所以通常会经由P</w:t>
+        <w:t>层广播，而不是子网广播，所以通常会经由</w:t>
+      </w:r>
+      <w:r>
+        <w:rPr>
+          <w:rFonts w:hint="eastAsia"/>
+        </w:rPr>
+        <w:t>P</w:t>
       </w:r>
       <w:r>
         <w:t>C</w:t>
@@ -536,7 +744,13 @@
         <w:rPr>
           <w:rFonts w:hint="eastAsia"/>
         </w:rPr>
-        <w:t>（W</w:t>
+        <w:t>（</w:t>
+      </w:r>
+      <w:r>
+        <w:rPr>
+          <w:rFonts w:hint="eastAsia"/>
+        </w:rPr>
+        <w:t>W</w:t>
       </w:r>
       <w:r>
         <w:t>indows</w:t>
@@ -545,7 +759,13 @@
         <w:rPr>
           <w:rFonts w:hint="eastAsia"/>
         </w:rPr>
-        <w:t>系统）路由表项中目的地址为2</w:t>
+        <w:t>系统）路由表项中目的地址为</w:t>
+      </w:r>
+      <w:r>
+        <w:rPr>
+          <w:rFonts w:hint="eastAsia"/>
+        </w:rPr>
+        <w:t>2</w:t>
       </w:r>
       <w:r>
         <w:t>55.255.255.255</w:t>
@@ -554,7 +774,13 @@
         <w:rPr>
           <w:rFonts w:hint="eastAsia"/>
         </w:rPr>
-        <w:t>的表项接口发出；而通常系统路由表中有多个这种表项（可通过r</w:t>
+        <w:t>的表项接口发出；而通常系统路由表中有多个这种表项（可通过</w:t>
+      </w:r>
+      <w:r>
+        <w:rPr>
+          <w:rFonts w:hint="eastAsia"/>
+        </w:rPr>
+        <w:t>r</w:t>
       </w:r>
       <w:r>
         <w:t>oute print</w:t>
@@ -563,7 +789,13 @@
         <w:rPr>
           <w:rFonts w:hint="eastAsia"/>
         </w:rPr>
-        <w:t>命令查看），如果与探测相连的接口对应的表项优先级不够高（跃点数不够低），探测器库函数发出的受限广播会从其它接口发出，导致库函数无法连接到探测器。解决方案是在设置静态I</w:t>
+        <w:t>命令查看），如果与探测相连的接口对应的表项优先级不够高（跃点数不够低），探测器库函数发出的受限广播会从其它接口发出，导致库函数无法连接到探测器。解决方案是在设置静态</w:t>
+      </w:r>
+      <w:r>
+        <w:rPr>
+          <w:rFonts w:hint="eastAsia"/>
+        </w:rPr>
+        <w:t>I</w:t>
       </w:r>
       <w:r>
         <w:t>P</w:t>
@@ -577,14 +809,16 @@
     </w:p>
     <w:p>
       <w:pPr>
-        <w:pStyle w:val="22"/>
-        <w:ind w:left="420" w:firstLine="0" w:firstLineChars="0"/>
+        <w:pStyle w:val="a3"/>
+        <w:ind w:left="420" w:firstLineChars="0" w:firstLine="0"/>
         <w:jc w:val="center"/>
       </w:pPr>
       <w:r>
         <w:rPr>
           <w:rFonts w:hint="eastAsia"/>
-        </w:rPr>
+          <w:noProof/>
+        </w:rPr>
+        <w:lastRenderedPageBreak/>
         <w:drawing>
           <wp:inline distT="0" distB="0" distL="0" distR="0">
             <wp:extent cx="3889375" cy="5219065"/>
@@ -603,7 +837,7 @@
                     </pic:cNvPicPr>
                   </pic:nvPicPr>
                   <pic:blipFill>
-                    <a:blip r:embed="rId10">
+                    <a:blip r:embed="rId11">
                       <a:extLst>
                         <a:ext uri="{28A0092B-C50C-407E-A947-70E740481C1C}">
                           <a14:useLocalDpi xmlns:a14="http://schemas.microsoft.com/office/drawing/2010/main" val="0"/>
@@ -637,7 +871,7 @@
     </w:p>
     <w:p>
       <w:pPr>
-        <w:pStyle w:val="22"/>
+        <w:pStyle w:val="a3"/>
         <w:numPr>
           <w:ilvl w:val="0"/>
           <w:numId w:val="4"/>
@@ -648,7 +882,13 @@
         <w:rPr>
           <w:rFonts w:hint="eastAsia"/>
         </w:rPr>
-        <w:t>探测器发往P</w:t>
+        <w:t>探测器发往</w:t>
+      </w:r>
+      <w:r>
+        <w:rPr>
+          <w:rFonts w:hint="eastAsia"/>
+        </w:rPr>
+        <w:t>P</w:t>
       </w:r>
       <w:r>
         <w:t>C</w:t>
@@ -657,7 +897,13 @@
         <w:rPr>
           <w:rFonts w:hint="eastAsia"/>
         </w:rPr>
-        <w:t>的数据包使用U</w:t>
+        <w:t>的数据包使用</w:t>
+      </w:r>
+      <w:r>
+        <w:rPr>
+          <w:rFonts w:hint="eastAsia"/>
+        </w:rPr>
+        <w:t>U</w:t>
       </w:r>
       <w:r>
         <w:t>DP</w:t>
@@ -666,7 +912,13 @@
         <w:rPr>
           <w:rFonts w:hint="eastAsia"/>
         </w:rPr>
-        <w:t>协议，目的端口是固定的6</w:t>
+        <w:t>协议，目的端口是固定的</w:t>
+      </w:r>
+      <w:r>
+        <w:rPr>
+          <w:rFonts w:hint="eastAsia"/>
+        </w:rPr>
+        <w:t>6</w:t>
       </w:r>
       <w:r>
         <w:t>5039</w:t>
@@ -675,7 +927,13 @@
         <w:rPr>
           <w:rFonts w:hint="eastAsia"/>
         </w:rPr>
-        <w:t>。承载该I</w:t>
+        <w:t>。承载该</w:t>
+      </w:r>
+      <w:r>
+        <w:rPr>
+          <w:rFonts w:hint="eastAsia"/>
+        </w:rPr>
+        <w:t>I</w:t>
       </w:r>
       <w:r>
         <w:t>P</w:t>
@@ -684,7 +942,13 @@
         <w:rPr>
           <w:rFonts w:hint="eastAsia"/>
         </w:rPr>
-        <w:t>报文的M</w:t>
+        <w:t>报文的</w:t>
+      </w:r>
+      <w:r>
+        <w:rPr>
+          <w:rFonts w:hint="eastAsia"/>
+        </w:rPr>
+        <w:t>M</w:t>
       </w:r>
       <w:r>
         <w:t>AC</w:t>
@@ -693,7 +957,25 @@
         <w:rPr>
           <w:rFonts w:hint="eastAsia"/>
         </w:rPr>
-        <w:t>层数据帧的目的地址是全1的广播地址。有些系统和网卡（如使用R</w:t>
+        <w:t>层数据帧的目的地址是全</w:t>
+      </w:r>
+      <w:r>
+        <w:rPr>
+          <w:rFonts w:hint="eastAsia"/>
+        </w:rPr>
+        <w:t>1</w:t>
+      </w:r>
+      <w:r>
+        <w:rPr>
+          <w:rFonts w:hint="eastAsia"/>
+        </w:rPr>
+        <w:t>的广播地址。有些系统和网卡（如使用</w:t>
+      </w:r>
+      <w:r>
+        <w:rPr>
+          <w:rFonts w:hint="eastAsia"/>
+        </w:rPr>
+        <w:t>R</w:t>
       </w:r>
       <w:r>
         <w:t>ealtek</w:t>
@@ -702,7 +984,13 @@
         <w:rPr>
           <w:rFonts w:hint="eastAsia"/>
         </w:rPr>
-        <w:t>芯片的一些网卡），对于这种封装I</w:t>
+        <w:t>芯片的一些网卡），对于这种封装</w:t>
+      </w:r>
+      <w:r>
+        <w:rPr>
+          <w:rFonts w:hint="eastAsia"/>
+        </w:rPr>
+        <w:t>I</w:t>
       </w:r>
       <w:r>
         <w:t>P</w:t>
@@ -711,7 +999,13 @@
         <w:rPr>
           <w:rFonts w:hint="eastAsia"/>
         </w:rPr>
-        <w:t>报文的广播M</w:t>
+        <w:t>报文的广播</w:t>
+      </w:r>
+      <w:r>
+        <w:rPr>
+          <w:rFonts w:hint="eastAsia"/>
+        </w:rPr>
+        <w:t>M</w:t>
       </w:r>
       <w:r>
         <w:t>AC</w:t>
@@ -720,7 +1014,13 @@
         <w:rPr>
           <w:rFonts w:hint="eastAsia"/>
         </w:rPr>
-        <w:t>帧会直接丢弃，导致P</w:t>
+        <w:t>帧会直接丢弃，导致</w:t>
+      </w:r>
+      <w:r>
+        <w:rPr>
+          <w:rFonts w:hint="eastAsia"/>
+        </w:rPr>
+        <w:t>P</w:t>
       </w:r>
       <w:r>
         <w:t>C</w:t>
@@ -729,7 +1029,13 @@
         <w:rPr>
           <w:rFonts w:hint="eastAsia"/>
         </w:rPr>
-        <w:t>端软件能够与探测器建立连接，但收不到探测器发来的数据。这种情况似乎没有好的解决办法，只能更换P</w:t>
+        <w:t>端软件能够与探测器建立连接，但收不到探测器发来的数据。这种情况似乎没有好的解决办法，只能更换</w:t>
+      </w:r>
+      <w:r>
+        <w:rPr>
+          <w:rFonts w:hint="eastAsia"/>
+        </w:rPr>
+        <w:t>P</w:t>
       </w:r>
       <w:r>
         <w:t>C</w:t>
@@ -744,7 +1050,7 @@
     <w:p/>
     <w:p>
       <w:pPr>
-        <w:pStyle w:val="2"/>
+        <w:pStyle w:val="1"/>
         <w:rPr>
           <w:sz w:val="30"/>
           <w:szCs w:val="30"/>
@@ -756,18 +1062,40 @@
           <w:sz w:val="30"/>
           <w:szCs w:val="30"/>
         </w:rPr>
-        <w:t>附 数据结构</w:t>
+        <w:t>附</w:t>
+      </w:r>
+      <w:r>
+        <w:rPr>
+          <w:rFonts w:hint="eastAsia"/>
+          <w:sz w:val="30"/>
+          <w:szCs w:val="30"/>
+        </w:rPr>
+        <w:t xml:space="preserve"> </w:t>
+      </w:r>
+      <w:r>
+        <w:rPr>
+          <w:rFonts w:hint="eastAsia"/>
+          <w:sz w:val="30"/>
+          <w:szCs w:val="30"/>
+        </w:rPr>
+        <w:t>数据结构</w:t>
       </w:r>
     </w:p>
     <w:p>
       <w:pPr>
-        <w:ind w:firstLine="480" w:firstLineChars="200"/>
-      </w:pPr>
-      <w:r>
-        <w:rPr>
-          <w:rFonts w:hint="eastAsia"/>
-        </w:rPr>
-        <w:t>每能区每“行”数据为2</w:t>
+        <w:ind w:firstLineChars="200" w:firstLine="480"/>
+      </w:pPr>
+      <w:r>
+        <w:rPr>
+          <w:rFonts w:hint="eastAsia"/>
+        </w:rPr>
+        <w:t>每能区每“行”数据为</w:t>
+      </w:r>
+      <w:r>
+        <w:rPr>
+          <w:rFonts w:hint="eastAsia"/>
+        </w:rPr>
+        <w:t>2</w:t>
       </w:r>
       <w:r>
         <w:t>56</w:t>
@@ -776,7 +1104,25 @@
         <w:rPr>
           <w:rFonts w:hint="eastAsia"/>
         </w:rPr>
-        <w:t>个像素（4个c</w:t>
+        <w:t>个像素（</w:t>
+      </w:r>
+      <w:r>
+        <w:rPr>
+          <w:rFonts w:hint="eastAsia"/>
+        </w:rPr>
+        <w:t>4</w:t>
+      </w:r>
+      <w:r>
+        <w:rPr>
+          <w:rFonts w:hint="eastAsia"/>
+        </w:rPr>
+        <w:t>个</w:t>
+      </w:r>
+      <w:r>
+        <w:rPr>
+          <w:rFonts w:hint="eastAsia"/>
+        </w:rPr>
+        <w:t>c</w:t>
       </w:r>
       <w:r>
         <w:t>ard</w:t>
@@ -785,7 +1131,13 @@
         <w:rPr>
           <w:rFonts w:hint="eastAsia"/>
         </w:rPr>
-        <w:t>，每个6</w:t>
+        <w:t>，每个</w:t>
+      </w:r>
+      <w:r>
+        <w:rPr>
+          <w:rFonts w:hint="eastAsia"/>
+        </w:rPr>
+        <w:t>6</w:t>
       </w:r>
       <w:r>
         <w:t>4</w:t>
@@ -794,7 +1146,13 @@
         <w:rPr>
           <w:rFonts w:hint="eastAsia"/>
         </w:rPr>
-        <w:t>像素），每像素1</w:t>
+        <w:t>像素），每像素</w:t>
+      </w:r>
+      <w:r>
+        <w:rPr>
+          <w:rFonts w:hint="eastAsia"/>
+        </w:rPr>
+        <w:t>1</w:t>
       </w:r>
       <w:r>
         <w:t>6bit</w:t>
@@ -808,13 +1166,19 @@
     </w:p>
     <w:p>
       <w:pPr>
-        <w:ind w:firstLine="480" w:firstLineChars="200"/>
-      </w:pPr>
-      <w:r>
-        <w:rPr>
-          <w:rFonts w:hint="eastAsia"/>
-        </w:rPr>
-        <w:t>1“帧（</w:t>
+        <w:ind w:firstLineChars="200" w:firstLine="480"/>
+      </w:pPr>
+      <w:r>
+        <w:rPr>
+          <w:rFonts w:hint="eastAsia"/>
+        </w:rPr>
+        <w:t>1</w:t>
+      </w:r>
+      <w:r>
+        <w:rPr>
+          <w:rFonts w:hint="eastAsia"/>
+        </w:rPr>
+        <w:t>“帧（</w:t>
       </w:r>
       <w:r>
         <w:t>frame</w:t>
@@ -823,7 +1187,49 @@
         <w:rPr>
           <w:rFonts w:hint="eastAsia"/>
         </w:rPr>
-        <w:t>）”为所有能区1行数据的集合，顺序排列。探测器共3个能区，因此1帧数据为2</w:t>
+        <w:t>）”为所有能区</w:t>
+      </w:r>
+      <w:r>
+        <w:rPr>
+          <w:rFonts w:hint="eastAsia"/>
+        </w:rPr>
+        <w:t>1</w:t>
+      </w:r>
+      <w:r>
+        <w:rPr>
+          <w:rFonts w:hint="eastAsia"/>
+        </w:rPr>
+        <w:t>行数据的集合，顺序排列。探测器共</w:t>
+      </w:r>
+      <w:r>
+        <w:rPr>
+          <w:rFonts w:hint="eastAsia"/>
+        </w:rPr>
+        <w:t>3</w:t>
+      </w:r>
+      <w:r>
+        <w:rPr>
+          <w:rFonts w:hint="eastAsia"/>
+        </w:rPr>
+        <w:t>个能区，因此</w:t>
+      </w:r>
+      <w:r>
+        <w:rPr>
+          <w:rFonts w:hint="eastAsia"/>
+        </w:rPr>
+        <w:t>1</w:t>
+      </w:r>
+      <w:r>
+        <w:rPr>
+          <w:rFonts w:hint="eastAsia"/>
+        </w:rPr>
+        <w:t>帧数据为</w:t>
+      </w:r>
+      <w:r>
+        <w:rPr>
+          <w:rFonts w:hint="eastAsia"/>
+        </w:rPr>
+        <w:t>2</w:t>
       </w:r>
       <w:r>
         <w:t>56*3</w:t>
@@ -832,17 +1238,90 @@
         <w:rPr>
           <w:rFonts w:hint="eastAsia"/>
         </w:rPr>
-        <w:t>个像素，第0、1、2行分别为第1、2、3能区的数据。</w:t>
+        <w:t>个像素，第</w:t>
+      </w:r>
+      <w:r>
+        <w:rPr>
+          <w:rFonts w:hint="eastAsia"/>
+        </w:rPr>
+        <w:t>0</w:t>
+      </w:r>
+      <w:r>
+        <w:rPr>
+          <w:rFonts w:hint="eastAsia"/>
+        </w:rPr>
+        <w:t>、</w:t>
+      </w:r>
+      <w:r>
+        <w:rPr>
+          <w:rFonts w:hint="eastAsia"/>
+        </w:rPr>
+        <w:t>1</w:t>
+      </w:r>
+      <w:r>
+        <w:rPr>
+          <w:rFonts w:hint="eastAsia"/>
+        </w:rPr>
+        <w:t>、</w:t>
+      </w:r>
+      <w:r>
+        <w:rPr>
+          <w:rFonts w:hint="eastAsia"/>
+        </w:rPr>
+        <w:t>2</w:t>
+      </w:r>
+      <w:r>
+        <w:rPr>
+          <w:rFonts w:hint="eastAsia"/>
+        </w:rPr>
+        <w:t>行分别为第</w:t>
+      </w:r>
+      <w:r>
+        <w:rPr>
+          <w:rFonts w:hint="eastAsia"/>
+        </w:rPr>
+        <w:t>1</w:t>
+      </w:r>
+      <w:r>
+        <w:rPr>
+          <w:rFonts w:hint="eastAsia"/>
+        </w:rPr>
+        <w:t>、</w:t>
+      </w:r>
+      <w:r>
+        <w:rPr>
+          <w:rFonts w:hint="eastAsia"/>
+        </w:rPr>
+        <w:t>2</w:t>
+      </w:r>
+      <w:r>
+        <w:rPr>
+          <w:rFonts w:hint="eastAsia"/>
+        </w:rPr>
+        <w:t>、</w:t>
+      </w:r>
+      <w:r>
+        <w:rPr>
+          <w:rFonts w:hint="eastAsia"/>
+        </w:rPr>
+        <w:t>3</w:t>
+      </w:r>
+      <w:r>
+        <w:rPr>
+          <w:rFonts w:hint="eastAsia"/>
+        </w:rPr>
+        <w:t>能区的数据。</w:t>
       </w:r>
     </w:p>
     <w:p>
       <w:pPr>
-        <w:ind w:firstLine="480" w:firstLineChars="200"/>
-      </w:pPr>
-      <w:r>
-        <w:rPr>
-          <w:rFonts w:hint="eastAsia"/>
-        </w:rPr>
+        <w:ind w:firstLineChars="200" w:firstLine="480"/>
+      </w:pPr>
+      <w:r>
+        <w:rPr>
+          <w:rFonts w:hint="eastAsia"/>
+        </w:rPr>
+        <w:lastRenderedPageBreak/>
         <w:t>“设置帧大小”中的值，表示每次</w:t>
       </w:r>
       <w:r>
@@ -852,7 +1331,13 @@
         <w:rPr>
           <w:rFonts w:hint="eastAsia"/>
         </w:rPr>
-        <w:t>信号到来时，探测器上报的帧数。以默认值6</w:t>
+        <w:t>信号到来时，探测器上报的帧数。以默认值</w:t>
+      </w:r>
+      <w:r>
+        <w:rPr>
+          <w:rFonts w:hint="eastAsia"/>
+        </w:rPr>
+        <w:t>6</w:t>
       </w:r>
       <w:r>
         <w:t>4</w:t>
@@ -879,7 +1364,13 @@
         <w:rPr>
           <w:rFonts w:hint="eastAsia"/>
         </w:rPr>
-        <w:t>帧、即2</w:t>
+        <w:t>帧、即</w:t>
+      </w:r>
+      <w:r>
+        <w:rPr>
+          <w:rFonts w:hint="eastAsia"/>
+        </w:rPr>
+        <w:t>2</w:t>
       </w:r>
       <w:r>
         <w:t>56</w:t>
@@ -906,18 +1397,180 @@
         <w:rPr>
           <w:rFonts w:hint="eastAsia"/>
         </w:rPr>
-        <w:t>个像素的数据。第0、3、6……行为1能区；第1、4、7……行为2能区；第2、5、8……行为3能区。</w:t>
+        <w:t>个像素的数据。第</w:t>
+      </w:r>
+      <w:r>
+        <w:rPr>
+          <w:rFonts w:hint="eastAsia"/>
+        </w:rPr>
+        <w:t>0</w:t>
+      </w:r>
+      <w:r>
+        <w:rPr>
+          <w:rFonts w:hint="eastAsia"/>
+        </w:rPr>
+        <w:t>、</w:t>
+      </w:r>
+      <w:r>
+        <w:rPr>
+          <w:rFonts w:hint="eastAsia"/>
+        </w:rPr>
+        <w:t>3</w:t>
+      </w:r>
+      <w:r>
+        <w:rPr>
+          <w:rFonts w:hint="eastAsia"/>
+        </w:rPr>
+        <w:t>、</w:t>
+      </w:r>
+      <w:r>
+        <w:rPr>
+          <w:rFonts w:hint="eastAsia"/>
+        </w:rPr>
+        <w:t>6</w:t>
+      </w:r>
+      <w:r>
+        <w:rPr>
+          <w:rFonts w:hint="eastAsia"/>
+        </w:rPr>
+        <w:t>……行为</w:t>
+      </w:r>
+      <w:r>
+        <w:rPr>
+          <w:rFonts w:hint="eastAsia"/>
+        </w:rPr>
+        <w:t>1</w:t>
+      </w:r>
+      <w:r>
+        <w:rPr>
+          <w:rFonts w:hint="eastAsia"/>
+        </w:rPr>
+        <w:t>能区；第</w:t>
+      </w:r>
+      <w:r>
+        <w:rPr>
+          <w:rFonts w:hint="eastAsia"/>
+        </w:rPr>
+        <w:t>1</w:t>
+      </w:r>
+      <w:r>
+        <w:rPr>
+          <w:rFonts w:hint="eastAsia"/>
+        </w:rPr>
+        <w:t>、</w:t>
+      </w:r>
+      <w:r>
+        <w:rPr>
+          <w:rFonts w:hint="eastAsia"/>
+        </w:rPr>
+        <w:t>4</w:t>
+      </w:r>
+      <w:r>
+        <w:rPr>
+          <w:rFonts w:hint="eastAsia"/>
+        </w:rPr>
+        <w:t>、</w:t>
+      </w:r>
+      <w:r>
+        <w:rPr>
+          <w:rFonts w:hint="eastAsia"/>
+        </w:rPr>
+        <w:t>7</w:t>
+      </w:r>
+      <w:r>
+        <w:rPr>
+          <w:rFonts w:hint="eastAsia"/>
+        </w:rPr>
+        <w:t>……行为</w:t>
+      </w:r>
+      <w:r>
+        <w:rPr>
+          <w:rFonts w:hint="eastAsia"/>
+        </w:rPr>
+        <w:t>2</w:t>
+      </w:r>
+      <w:r>
+        <w:rPr>
+          <w:rFonts w:hint="eastAsia"/>
+        </w:rPr>
+        <w:t>能区；第</w:t>
+      </w:r>
+      <w:r>
+        <w:rPr>
+          <w:rFonts w:hint="eastAsia"/>
+        </w:rPr>
+        <w:t>2</w:t>
+      </w:r>
+      <w:r>
+        <w:rPr>
+          <w:rFonts w:hint="eastAsia"/>
+        </w:rPr>
+        <w:t>、</w:t>
+      </w:r>
+      <w:r>
+        <w:rPr>
+          <w:rFonts w:hint="eastAsia"/>
+        </w:rPr>
+        <w:t>5</w:t>
+      </w:r>
+      <w:r>
+        <w:rPr>
+          <w:rFonts w:hint="eastAsia"/>
+        </w:rPr>
+        <w:t>、</w:t>
+      </w:r>
+      <w:r>
+        <w:rPr>
+          <w:rFonts w:hint="eastAsia"/>
+        </w:rPr>
+        <w:t>8</w:t>
+      </w:r>
+      <w:r>
+        <w:rPr>
+          <w:rFonts w:hint="eastAsia"/>
+        </w:rPr>
+        <w:t>……行为</w:t>
+      </w:r>
+      <w:r>
+        <w:rPr>
+          <w:rFonts w:hint="eastAsia"/>
+        </w:rPr>
+        <w:t>3</w:t>
+      </w:r>
+      <w:r>
+        <w:rPr>
+          <w:rFonts w:hint="eastAsia"/>
+        </w:rPr>
+        <w:t>能区。</w:t>
       </w:r>
     </w:p>
     <w:p>
       <w:pPr>
-        <w:ind w:firstLine="480" w:firstLineChars="200"/>
-      </w:pPr>
-      <w:r>
-        <w:rPr>
-          <w:rFonts w:hint="eastAsia"/>
-        </w:rPr>
-        <w:t>“设置帧大小”接口本身没有最小值的限制，设置为1也可成功。但实际运行情况来看，似乎不小于1</w:t>
+        <w:ind w:firstLineChars="200" w:firstLine="480"/>
+      </w:pPr>
+      <w:r>
+        <w:rPr>
+          <w:rFonts w:hint="eastAsia"/>
+        </w:rPr>
+        <w:t>“设置帧大小”接口本身没有最小值的限制，设置为</w:t>
+      </w:r>
+      <w:r>
+        <w:rPr>
+          <w:rFonts w:hint="eastAsia"/>
+        </w:rPr>
+        <w:t>1</w:t>
+      </w:r>
+      <w:r>
+        <w:rPr>
+          <w:rFonts w:hint="eastAsia"/>
+        </w:rPr>
+        <w:t>也可成功。但实际运行情况来看，似乎不小于</w:t>
+      </w:r>
+      <w:r>
+        <w:rPr>
+          <w:rFonts w:hint="eastAsia"/>
+        </w:rPr>
+        <w:t>1</w:t>
       </w:r>
       <w:r>
         <w:t>6</w:t>
@@ -926,7 +1579,31 @@
         <w:rPr>
           <w:rFonts w:hint="eastAsia"/>
         </w:rPr>
-        <w:t>的值才是合理的：设置为1时，也会收到1</w:t>
+        <w:t>的值才是合理的</w:t>
+      </w:r>
+      <w:r>
+        <w:rPr>
+          <w:rFonts w:hint="eastAsia"/>
+        </w:rPr>
+        <w:t>：设置为</w:t>
+      </w:r>
+      <w:r>
+        <w:rPr>
+          <w:rFonts w:hint="eastAsia"/>
+        </w:rPr>
+        <w:t>1</w:t>
+      </w:r>
+      <w:r>
+        <w:rPr>
+          <w:rFonts w:hint="eastAsia"/>
+        </w:rPr>
+        <w:t>时，也会收到</w:t>
+      </w:r>
+      <w:r>
+        <w:rPr>
+          <w:rFonts w:hint="eastAsia"/>
+        </w:rPr>
+        <w:t>1</w:t>
       </w:r>
       <w:r>
         <w:t>6</w:t>
@@ -941,16 +1618,16 @@
     <w:sectPr>
       <w:pgSz w:w="11906" w:h="16838"/>
       <w:pgMar w:top="1440" w:right="1800" w:bottom="1440" w:left="1800" w:header="851" w:footer="992" w:gutter="0"/>
-      <w:cols w:space="425" w:num="1"/>
-      <w:docGrid w:type="lines" w:linePitch="312" w:charSpace="0"/>
+      <w:cols w:space="425"/>
+      <w:docGrid w:type="lines" w:linePitch="312"/>
     </w:sectPr>
   </w:body>
 </w:document>
 </file>
 
 <file path=word/endnotes.xml><?xml version="1.0" encoding="utf-8"?>
-<w:endnotes xmlns:wpc="http://schemas.microsoft.com/office/word/2010/wordprocessingCanvas" xmlns:mc="http://schemas.openxmlformats.org/markup-compatibility/2006" xmlns:o="urn:schemas-microsoft-com:office:office" xmlns:r="http://schemas.openxmlformats.org/officeDocument/2006/relationships" xmlns:m="http://schemas.openxmlformats.org/officeDocument/2006/math" xmlns:v="urn:schemas-microsoft-com:vml" xmlns:wp14="http://schemas.microsoft.com/office/word/2010/wordprocessingDrawing" xmlns:wp="http://schemas.openxmlformats.org/drawingml/2006/wordprocessingDrawing" xmlns:w="http://schemas.openxmlformats.org/wordprocessingml/2006/main" xmlns:w14="http://schemas.microsoft.com/office/word/2010/wordml" xmlns:w15="http://schemas.microsoft.com/office/word/2012/wordml" xmlns:w10="urn:schemas-microsoft-com:office:word" xmlns:wpg="http://schemas.microsoft.com/office/word/2010/wordprocessingGroup" xmlns:wpi="http://schemas.microsoft.com/office/word/2010/wordprocessingInk" xmlns:wne="http://schemas.microsoft.com/office/word/2006/wordml" xmlns:wps="http://schemas.microsoft.com/office/word/2010/wordprocessingShape" xmlns:wpsCustomData="http://www.wps.cn/officeDocument/2013/wpsCustomData" mc:Ignorable="w14 w15 wp14">
-  <w:endnote w:type="separator" w:id="0">
+<w:endnotes xmlns:wpc="http://schemas.microsoft.com/office/word/2010/wordprocessingCanvas" xmlns:cx="http://schemas.microsoft.com/office/drawing/2014/chartex" xmlns:cx1="http://schemas.microsoft.com/office/drawing/2015/9/8/chartex" xmlns:mc="http://schemas.openxmlformats.org/markup-compatibility/2006" xmlns:o="urn:schemas-microsoft-com:office:office" xmlns:r="http://schemas.openxmlformats.org/officeDocument/2006/relationships" xmlns:m="http://schemas.openxmlformats.org/officeDocument/2006/math" xmlns:v="urn:schemas-microsoft-com:vml" xmlns:wp14="http://schemas.microsoft.com/office/word/2010/wordprocessingDrawing" xmlns:wp="http://schemas.openxmlformats.org/drawingml/2006/wordprocessingDrawing" xmlns:w10="urn:schemas-microsoft-com:office:word" xmlns:w="http://schemas.openxmlformats.org/wordprocessingml/2006/main" xmlns:w14="http://schemas.microsoft.com/office/word/2010/wordml" xmlns:w15="http://schemas.microsoft.com/office/word/2012/wordml" xmlns:w16se="http://schemas.microsoft.com/office/word/2015/wordml/symex" xmlns:wpg="http://schemas.microsoft.com/office/word/2010/wordprocessingGroup" xmlns:wpi="http://schemas.microsoft.com/office/word/2010/wordprocessingInk" xmlns:wne="http://schemas.microsoft.com/office/word/2006/wordml" xmlns:wps="http://schemas.microsoft.com/office/word/2010/wordprocessingShape" mc:Ignorable="w14 w15 w16se wp14">
+  <w:endnote w:type="separator" w:id="-1">
     <w:p>
       <w:pPr>
         <w:spacing w:line="240" w:lineRule="auto"/>
@@ -960,7 +1637,7 @@
       </w:r>
     </w:p>
   </w:endnote>
-  <w:endnote w:type="continuationSeparator" w:id="1">
+  <w:endnote w:type="continuationSeparator" w:id="0">
     <w:p>
       <w:pPr>
         <w:spacing w:line="240" w:lineRule="auto"/>
@@ -974,22 +1651,16 @@
 </file>
 
 <file path=word/footnotes.xml><?xml version="1.0" encoding="utf-8"?>
-<w:footnotes xmlns:wpc="http://schemas.microsoft.com/office/word/2010/wordprocessingCanvas" xmlns:mc="http://schemas.openxmlformats.org/markup-compatibility/2006" xmlns:o="urn:schemas-microsoft-com:office:office" xmlns:r="http://schemas.openxmlformats.org/officeDocument/2006/relationships" xmlns:m="http://schemas.openxmlformats.org/officeDocument/2006/math" xmlns:v="urn:schemas-microsoft-com:vml" xmlns:wp14="http://schemas.microsoft.com/office/word/2010/wordprocessingDrawing" xmlns:wp="http://schemas.openxmlformats.org/drawingml/2006/wordprocessingDrawing" xmlns:w="http://schemas.openxmlformats.org/wordprocessingml/2006/main" xmlns:w14="http://schemas.microsoft.com/office/word/2010/wordml" xmlns:w15="http://schemas.microsoft.com/office/word/2012/wordml" xmlns:w10="urn:schemas-microsoft-com:office:word" xmlns:wpg="http://schemas.microsoft.com/office/word/2010/wordprocessingGroup" xmlns:wpi="http://schemas.microsoft.com/office/word/2010/wordprocessingInk" xmlns:wne="http://schemas.microsoft.com/office/word/2006/wordml" xmlns:wps="http://schemas.microsoft.com/office/word/2010/wordprocessingShape" xmlns:wpsCustomData="http://www.wps.cn/officeDocument/2013/wpsCustomData" mc:Ignorable="w14 w15 wp14">
-  <w:footnote w:type="separator" w:id="0">
+<w:footnotes xmlns:wpc="http://schemas.microsoft.com/office/word/2010/wordprocessingCanvas" xmlns:cx="http://schemas.microsoft.com/office/drawing/2014/chartex" xmlns:cx1="http://schemas.microsoft.com/office/drawing/2015/9/8/chartex" xmlns:mc="http://schemas.openxmlformats.org/markup-compatibility/2006" xmlns:o="urn:schemas-microsoft-com:office:office" xmlns:r="http://schemas.openxmlformats.org/officeDocument/2006/relationships" xmlns:m="http://schemas.openxmlformats.org/officeDocument/2006/math" xmlns:v="urn:schemas-microsoft-com:vml" xmlns:wp14="http://schemas.microsoft.com/office/word/2010/wordprocessingDrawing" xmlns:wp="http://schemas.openxmlformats.org/drawingml/2006/wordprocessingDrawing" xmlns:w10="urn:schemas-microsoft-com:office:word" xmlns:w="http://schemas.openxmlformats.org/wordprocessingml/2006/main" xmlns:w14="http://schemas.microsoft.com/office/word/2010/wordml" xmlns:w15="http://schemas.microsoft.com/office/word/2012/wordml" xmlns:w16se="http://schemas.microsoft.com/office/word/2015/wordml/symex" xmlns:wpg="http://schemas.microsoft.com/office/word/2010/wordprocessingGroup" xmlns:wpi="http://schemas.microsoft.com/office/word/2010/wordprocessingInk" xmlns:wne="http://schemas.microsoft.com/office/word/2006/wordml" xmlns:wps="http://schemas.microsoft.com/office/word/2010/wordprocessingShape" mc:Ignorable="w14 w15 w16se wp14">
+  <w:footnote w:type="separator" w:id="-1">
     <w:p>
-      <w:pPr>
-        <w:spacing w:line="360" w:lineRule="auto"/>
-      </w:pPr>
       <w:r>
         <w:separator/>
       </w:r>
     </w:p>
   </w:footnote>
-  <w:footnote w:type="continuationSeparator" w:id="1">
+  <w:footnote w:type="continuationSeparator" w:id="0">
     <w:p>
-      <w:pPr>
-        <w:spacing w:line="360" w:lineRule="auto"/>
-      </w:pPr>
       <w:r>
         <w:continuationSeparator/>
       </w:r>
@@ -999,12 +1670,12 @@
 </file>
 
 <file path=word/numbering.xml><?xml version="1.0" encoding="utf-8"?>
-<w:numbering xmlns:wpc="http://schemas.microsoft.com/office/word/2010/wordprocessingCanvas" xmlns:mc="http://schemas.openxmlformats.org/markup-compatibility/2006" xmlns:o="urn:schemas-microsoft-com:office:office" xmlns:r="http://schemas.openxmlformats.org/officeDocument/2006/relationships" xmlns:m="http://schemas.openxmlformats.org/officeDocument/2006/math" xmlns:v="urn:schemas-microsoft-com:vml" xmlns:wp14="http://schemas.microsoft.com/office/word/2010/wordprocessingDrawing" xmlns:wp="http://schemas.openxmlformats.org/drawingml/2006/wordprocessingDrawing" xmlns:w10="urn:schemas-microsoft-com:office:word" xmlns:w="http://schemas.openxmlformats.org/wordprocessingml/2006/main" xmlns:w14="http://schemas.microsoft.com/office/word/2010/wordml" xmlns:wpg="http://schemas.microsoft.com/office/word/2010/wordprocessingGroup" xmlns:wpi="http://schemas.microsoft.com/office/word/2010/wordprocessingInk" xmlns:wne="http://schemas.microsoft.com/office/word/2006/wordml" xmlns:wps="http://schemas.microsoft.com/office/word/2010/wordprocessingShape" xmlns:wpsCustomData="http://www.wps.cn/officeDocument/2013/wpsCustomData" mc:Ignorable="w14 wp14">
-  <w:abstractNum w:abstractNumId="0">
+<w:numbering xmlns:wpc="http://schemas.microsoft.com/office/word/2010/wordprocessingCanvas" xmlns:cx="http://schemas.microsoft.com/office/drawing/2014/chartex" xmlns:cx1="http://schemas.microsoft.com/office/drawing/2015/9/8/chartex" xmlns:mc="http://schemas.openxmlformats.org/markup-compatibility/2006" xmlns:o="urn:schemas-microsoft-com:office:office" xmlns:r="http://schemas.openxmlformats.org/officeDocument/2006/relationships" xmlns:m="http://schemas.openxmlformats.org/officeDocument/2006/math" xmlns:v="urn:schemas-microsoft-com:vml" xmlns:wp14="http://schemas.microsoft.com/office/word/2010/wordprocessingDrawing" xmlns:wp="http://schemas.openxmlformats.org/drawingml/2006/wordprocessingDrawing" xmlns:w10="urn:schemas-microsoft-com:office:word" xmlns:w="http://schemas.openxmlformats.org/wordprocessingml/2006/main" xmlns:w14="http://schemas.microsoft.com/office/word/2010/wordml" xmlns:w15="http://schemas.microsoft.com/office/word/2012/wordml" xmlns:w16se="http://schemas.microsoft.com/office/word/2015/wordml/symex" xmlns:wpg="http://schemas.microsoft.com/office/word/2010/wordprocessingGroup" xmlns:wpi="http://schemas.microsoft.com/office/word/2010/wordprocessingInk" xmlns:wne="http://schemas.microsoft.com/office/word/2006/wordml" xmlns:wps="http://schemas.microsoft.com/office/word/2010/wordprocessingShape" mc:Ignorable="w14 w15 w16se wp14">
+  <w:abstractNum w:abstractNumId="0" w15:restartNumberingAfterBreak="0">
     <w:nsid w:val="0689531A"/>
     <w:multiLevelType w:val="multilevel"/>
     <w:tmpl w:val="0689531A"/>
-    <w:lvl w:ilvl="0" w:tentative="0">
+    <w:lvl w:ilvl="0">
       <w:start w:val="1"/>
       <w:numFmt w:val="decimal"/>
       <w:lvlText w:val="%1"/>
@@ -1016,7 +1687,7 @@
         <w:rFonts w:hint="eastAsia"/>
       </w:rPr>
     </w:lvl>
-    <w:lvl w:ilvl="1" w:tentative="0">
+    <w:lvl w:ilvl="1">
       <w:start w:val="1"/>
       <w:numFmt w:val="decimal"/>
       <w:lvlText w:val="%1.%2"/>
@@ -1028,7 +1699,7 @@
         <w:rFonts w:hint="eastAsia"/>
       </w:rPr>
     </w:lvl>
-    <w:lvl w:ilvl="2" w:tentative="0">
+    <w:lvl w:ilvl="2">
       <w:start w:val="1"/>
       <w:numFmt w:val="decimal"/>
       <w:lvlText w:val="%2.%1.%3"/>
@@ -1040,7 +1711,7 @@
         <w:rFonts w:hint="eastAsia"/>
       </w:rPr>
     </w:lvl>
-    <w:lvl w:ilvl="3" w:tentative="0">
+    <w:lvl w:ilvl="3">
       <w:start w:val="1"/>
       <w:numFmt w:val="decimal"/>
       <w:lvlText w:val="%1.%2.%3.%4"/>
@@ -1052,7 +1723,7 @@
         <w:rFonts w:hint="eastAsia"/>
       </w:rPr>
     </w:lvl>
-    <w:lvl w:ilvl="4" w:tentative="0">
+    <w:lvl w:ilvl="4">
       <w:start w:val="1"/>
       <w:numFmt w:val="decimal"/>
       <w:lvlText w:val="%1.%2.%3.%4.%5"/>
@@ -1064,7 +1735,7 @@
         <w:rFonts w:hint="eastAsia"/>
       </w:rPr>
     </w:lvl>
-    <w:lvl w:ilvl="5" w:tentative="0">
+    <w:lvl w:ilvl="5">
       <w:start w:val="1"/>
       <w:numFmt w:val="decimal"/>
       <w:lvlText w:val="%1.%2.%3.%4.%5.%6"/>
@@ -1076,7 +1747,7 @@
         <w:rFonts w:hint="eastAsia"/>
       </w:rPr>
     </w:lvl>
-    <w:lvl w:ilvl="6" w:tentative="0">
+    <w:lvl w:ilvl="6">
       <w:start w:val="1"/>
       <w:numFmt w:val="decimal"/>
       <w:lvlText w:val="%1.%2.%3.%4.%5.%6.%7"/>
@@ -1088,7 +1759,7 @@
         <w:rFonts w:hint="eastAsia"/>
       </w:rPr>
     </w:lvl>
-    <w:lvl w:ilvl="7" w:tentative="0">
+    <w:lvl w:ilvl="7">
       <w:start w:val="1"/>
       <w:numFmt w:val="decimal"/>
       <w:lvlText w:val="%1.%2.%3.%4.%5.%6.%7.%8"/>
@@ -1100,10 +1771,10 @@
         <w:rFonts w:hint="eastAsia"/>
       </w:rPr>
     </w:lvl>
-    <w:lvl w:ilvl="8" w:tentative="0">
+    <w:lvl w:ilvl="8">
       <w:start w:val="1"/>
       <w:numFmt w:val="decimal"/>
-      <w:pStyle w:val="10"/>
+      <w:pStyle w:val="9"/>
       <w:lvlText w:val="%1.%2.%3.%4.%5.%6.%7.%8.%9"/>
       <w:lvlJc w:val="left"/>
       <w:pPr>
@@ -1114,11 +1785,11 @@
       </w:rPr>
     </w:lvl>
   </w:abstractNum>
-  <w:abstractNum w:abstractNumId="1">
+  <w:abstractNum w:abstractNumId="1" w15:restartNumberingAfterBreak="0">
     <w:nsid w:val="142F0AEB"/>
     <w:multiLevelType w:val="multilevel"/>
     <w:tmpl w:val="142F0AEB"/>
-    <w:lvl w:ilvl="0" w:tentative="0">
+    <w:lvl w:ilvl="0">
       <w:start w:val="1"/>
       <w:numFmt w:val="bullet"/>
       <w:lvlText w:val=""/>
@@ -1127,10 +1798,10 @@
         <w:ind w:left="420" w:hanging="420"/>
       </w:pPr>
       <w:rPr>
-        <w:rFonts w:hint="default" w:ascii="Symbol" w:hAnsi="Symbol"/>
+        <w:rFonts w:ascii="Symbol" w:hAnsi="Symbol" w:hint="default"/>
       </w:rPr>
     </w:lvl>
-    <w:lvl w:ilvl="1" w:tentative="0">
+    <w:lvl w:ilvl="1">
       <w:start w:val="1"/>
       <w:numFmt w:val="bullet"/>
       <w:lvlText w:val=""/>
@@ -1139,10 +1810,10 @@
         <w:ind w:left="840" w:hanging="420"/>
       </w:pPr>
       <w:rPr>
-        <w:rFonts w:hint="default" w:ascii="Wingdings" w:hAnsi="Wingdings"/>
+        <w:rFonts w:ascii="Wingdings" w:hAnsi="Wingdings" w:hint="default"/>
       </w:rPr>
     </w:lvl>
-    <w:lvl w:ilvl="2" w:tentative="0">
+    <w:lvl w:ilvl="2">
       <w:start w:val="1"/>
       <w:numFmt w:val="bullet"/>
       <w:lvlText w:val=""/>
@@ -1151,10 +1822,10 @@
         <w:ind w:left="1260" w:hanging="420"/>
       </w:pPr>
       <w:rPr>
-        <w:rFonts w:hint="default" w:ascii="Wingdings" w:hAnsi="Wingdings"/>
+        <w:rFonts w:ascii="Wingdings" w:hAnsi="Wingdings" w:hint="default"/>
       </w:rPr>
     </w:lvl>
-    <w:lvl w:ilvl="3" w:tentative="0">
+    <w:lvl w:ilvl="3">
       <w:start w:val="1"/>
       <w:numFmt w:val="bullet"/>
       <w:lvlText w:val=""/>
@@ -1163,10 +1834,10 @@
         <w:ind w:left="1680" w:hanging="420"/>
       </w:pPr>
       <w:rPr>
-        <w:rFonts w:hint="default" w:ascii="Wingdings" w:hAnsi="Wingdings"/>
+        <w:rFonts w:ascii="Wingdings" w:hAnsi="Wingdings" w:hint="default"/>
       </w:rPr>
     </w:lvl>
-    <w:lvl w:ilvl="4" w:tentative="0">
+    <w:lvl w:ilvl="4">
       <w:start w:val="1"/>
       <w:numFmt w:val="bullet"/>
       <w:lvlText w:val=""/>
@@ -1175,10 +1846,10 @@
         <w:ind w:left="2100" w:hanging="420"/>
       </w:pPr>
       <w:rPr>
-        <w:rFonts w:hint="default" w:ascii="Wingdings" w:hAnsi="Wingdings"/>
+        <w:rFonts w:ascii="Wingdings" w:hAnsi="Wingdings" w:hint="default"/>
       </w:rPr>
     </w:lvl>
-    <w:lvl w:ilvl="5" w:tentative="0">
+    <w:lvl w:ilvl="5">
       <w:start w:val="1"/>
       <w:numFmt w:val="bullet"/>
       <w:lvlText w:val=""/>
@@ -1187,10 +1858,10 @@
         <w:ind w:left="2520" w:hanging="420"/>
       </w:pPr>
       <w:rPr>
-        <w:rFonts w:hint="default" w:ascii="Wingdings" w:hAnsi="Wingdings"/>
+        <w:rFonts w:ascii="Wingdings" w:hAnsi="Wingdings" w:hint="default"/>
       </w:rPr>
     </w:lvl>
-    <w:lvl w:ilvl="6" w:tentative="0">
+    <w:lvl w:ilvl="6">
       <w:start w:val="1"/>
       <w:numFmt w:val="bullet"/>
       <w:lvlText w:val=""/>
@@ -1199,10 +1870,10 @@
         <w:ind w:left="2940" w:hanging="420"/>
       </w:pPr>
       <w:rPr>
-        <w:rFonts w:hint="default" w:ascii="Wingdings" w:hAnsi="Wingdings"/>
+        <w:rFonts w:ascii="Wingdings" w:hAnsi="Wingdings" w:hint="default"/>
       </w:rPr>
     </w:lvl>
-    <w:lvl w:ilvl="7" w:tentative="0">
+    <w:lvl w:ilvl="7">
       <w:start w:val="1"/>
       <w:numFmt w:val="bullet"/>
       <w:lvlText w:val=""/>
@@ -1211,10 +1882,10 @@
         <w:ind w:left="3360" w:hanging="420"/>
       </w:pPr>
       <w:rPr>
-        <w:rFonts w:hint="default" w:ascii="Wingdings" w:hAnsi="Wingdings"/>
+        <w:rFonts w:ascii="Wingdings" w:hAnsi="Wingdings" w:hint="default"/>
       </w:rPr>
     </w:lvl>
-    <w:lvl w:ilvl="8" w:tentative="0">
+    <w:lvl w:ilvl="8">
       <w:start w:val="1"/>
       <w:numFmt w:val="bullet"/>
       <w:lvlText w:val=""/>
@@ -1223,18 +1894,18 @@
         <w:ind w:left="3780" w:hanging="420"/>
       </w:pPr>
       <w:rPr>
-        <w:rFonts w:hint="default" w:ascii="Wingdings" w:hAnsi="Wingdings"/>
+        <w:rFonts w:ascii="Wingdings" w:hAnsi="Wingdings" w:hint="default"/>
       </w:rPr>
     </w:lvl>
   </w:abstractNum>
-  <w:abstractNum w:abstractNumId="2">
+  <w:abstractNum w:abstractNumId="2" w15:restartNumberingAfterBreak="0">
     <w:nsid w:val="297C2D3A"/>
     <w:multiLevelType w:val="multilevel"/>
     <w:tmpl w:val="297C2D3A"/>
-    <w:lvl w:ilvl="0" w:tentative="0">
+    <w:lvl w:ilvl="0">
       <w:start w:val="1"/>
       <w:numFmt w:val="decimal"/>
-      <w:pStyle w:val="2"/>
+      <w:pStyle w:val="1"/>
       <w:lvlText w:val="%1"/>
       <w:lvlJc w:val="left"/>
       <w:pPr>
@@ -1244,10 +1915,10 @@
         <w:rFonts w:hint="eastAsia"/>
       </w:rPr>
     </w:lvl>
-    <w:lvl w:ilvl="1" w:tentative="0">
+    <w:lvl w:ilvl="1">
       <w:start w:val="1"/>
       <w:numFmt w:val="decimal"/>
-      <w:pStyle w:val="3"/>
+      <w:pStyle w:val="2"/>
       <w:lvlText w:val="%1.%2"/>
       <w:lvlJc w:val="left"/>
       <w:pPr>
@@ -1257,10 +1928,10 @@
         <w:rFonts w:hint="eastAsia"/>
       </w:rPr>
     </w:lvl>
-    <w:lvl w:ilvl="2" w:tentative="0">
+    <w:lvl w:ilvl="2">
       <w:start w:val="1"/>
       <w:numFmt w:val="decimal"/>
-      <w:pStyle w:val="4"/>
+      <w:pStyle w:val="3"/>
       <w:lvlText w:val="%1.%2.%3"/>
       <w:lvlJc w:val="left"/>
       <w:pPr>
@@ -1270,10 +1941,10 @@
         <w:rFonts w:hint="eastAsia"/>
       </w:rPr>
     </w:lvl>
-    <w:lvl w:ilvl="3" w:tentative="0">
+    <w:lvl w:ilvl="3">
       <w:start w:val="1"/>
       <w:numFmt w:val="decimal"/>
-      <w:pStyle w:val="5"/>
+      <w:pStyle w:val="4"/>
       <w:lvlText w:val="%1.%2.%3.%4"/>
       <w:lvlJc w:val="left"/>
       <w:pPr>
@@ -1283,10 +1954,10 @@
         <w:rFonts w:hint="eastAsia"/>
       </w:rPr>
     </w:lvl>
-    <w:lvl w:ilvl="4" w:tentative="0">
+    <w:lvl w:ilvl="4">
       <w:start w:val="1"/>
       <w:numFmt w:val="decimal"/>
-      <w:pStyle w:val="6"/>
+      <w:pStyle w:val="5"/>
       <w:lvlText w:val="%1.%2.%3.%4.%5"/>
       <w:lvlJc w:val="left"/>
       <w:pPr>
@@ -1296,10 +1967,10 @@
         <w:rFonts w:hint="eastAsia"/>
       </w:rPr>
     </w:lvl>
-    <w:lvl w:ilvl="5" w:tentative="0">
+    <w:lvl w:ilvl="5">
       <w:start w:val="1"/>
       <w:numFmt w:val="decimal"/>
-      <w:pStyle w:val="7"/>
+      <w:pStyle w:val="6"/>
       <w:lvlText w:val="%1.%2.%3.%4.%5.%6"/>
       <w:lvlJc w:val="left"/>
       <w:pPr>
@@ -1309,10 +1980,10 @@
         <w:rFonts w:hint="eastAsia"/>
       </w:rPr>
     </w:lvl>
-    <w:lvl w:ilvl="6" w:tentative="0">
+    <w:lvl w:ilvl="6">
       <w:start w:val="1"/>
       <w:numFmt w:val="decimal"/>
-      <w:pStyle w:val="8"/>
+      <w:pStyle w:val="7"/>
       <w:lvlText w:val="%1.%2.%3.%4.%5.%6.%7"/>
       <w:lvlJc w:val="left"/>
       <w:pPr>
@@ -1322,10 +1993,10 @@
         <w:rFonts w:hint="eastAsia"/>
       </w:rPr>
     </w:lvl>
-    <w:lvl w:ilvl="7" w:tentative="0">
+    <w:lvl w:ilvl="7">
       <w:start w:val="1"/>
       <w:numFmt w:val="decimal"/>
-      <w:pStyle w:val="9"/>
+      <w:pStyle w:val="8"/>
       <w:lvlText w:val="%1.%2.%3.%4.%5.%6.%7.%8"/>
       <w:lvlJc w:val="left"/>
       <w:pPr>
@@ -1335,7 +2006,7 @@
         <w:rFonts w:hint="eastAsia"/>
       </w:rPr>
     </w:lvl>
-    <w:lvl w:ilvl="8" w:tentative="0">
+    <w:lvl w:ilvl="8">
       <w:start w:val="1"/>
       <w:numFmt w:val="decimal"/>
       <w:lvlText w:val="%1.%2.%3.%4.%5.%6.%7.%8.%9"/>
@@ -1348,11 +2019,11 @@
       </w:rPr>
     </w:lvl>
   </w:abstractNum>
-  <w:abstractNum w:abstractNumId="3">
+  <w:abstractNum w:abstractNumId="3" w15:restartNumberingAfterBreak="0">
     <w:nsid w:val="5A081B17"/>
     <w:multiLevelType w:val="multilevel"/>
     <w:tmpl w:val="5A081B17"/>
-    <w:lvl w:ilvl="0" w:tentative="0">
+    <w:lvl w:ilvl="0">
       <w:start w:val="1"/>
       <w:numFmt w:val="decimal"/>
       <w:lvlText w:val="(%1)"/>
@@ -1364,7 +2035,7 @@
         <w:rFonts w:hint="eastAsia"/>
       </w:rPr>
     </w:lvl>
-    <w:lvl w:ilvl="1" w:tentative="0">
+    <w:lvl w:ilvl="1">
       <w:start w:val="1"/>
       <w:numFmt w:val="lowerLetter"/>
       <w:lvlText w:val="%2)"/>
@@ -1373,7 +2044,7 @@
         <w:ind w:left="840" w:hanging="420"/>
       </w:pPr>
     </w:lvl>
-    <w:lvl w:ilvl="2" w:tentative="0">
+    <w:lvl w:ilvl="2">
       <w:start w:val="1"/>
       <w:numFmt w:val="lowerRoman"/>
       <w:lvlText w:val="%3."/>
@@ -1382,7 +2053,7 @@
         <w:ind w:left="1260" w:hanging="420"/>
       </w:pPr>
     </w:lvl>
-    <w:lvl w:ilvl="3" w:tentative="0">
+    <w:lvl w:ilvl="3">
       <w:start w:val="1"/>
       <w:numFmt w:val="decimal"/>
       <w:lvlText w:val="%4."/>
@@ -1391,7 +2062,7 @@
         <w:ind w:left="1680" w:hanging="420"/>
       </w:pPr>
     </w:lvl>
-    <w:lvl w:ilvl="4" w:tentative="0">
+    <w:lvl w:ilvl="4">
       <w:start w:val="1"/>
       <w:numFmt w:val="lowerLetter"/>
       <w:lvlText w:val="%5)"/>
@@ -1400,7 +2071,7 @@
         <w:ind w:left="2100" w:hanging="420"/>
       </w:pPr>
     </w:lvl>
-    <w:lvl w:ilvl="5" w:tentative="0">
+    <w:lvl w:ilvl="5">
       <w:start w:val="1"/>
       <w:numFmt w:val="lowerRoman"/>
       <w:lvlText w:val="%6."/>
@@ -1409,7 +2080,7 @@
         <w:ind w:left="2520" w:hanging="420"/>
       </w:pPr>
     </w:lvl>
-    <w:lvl w:ilvl="6" w:tentative="0">
+    <w:lvl w:ilvl="6">
       <w:start w:val="1"/>
       <w:numFmt w:val="decimal"/>
       <w:lvlText w:val="%7."/>
@@ -1418,7 +2089,7 @@
         <w:ind w:left="2940" w:hanging="420"/>
       </w:pPr>
     </w:lvl>
-    <w:lvl w:ilvl="7" w:tentative="0">
+    <w:lvl w:ilvl="7">
       <w:start w:val="1"/>
       <w:numFmt w:val="lowerLetter"/>
       <w:lvlText w:val="%8)"/>
@@ -1427,7 +2098,7 @@
         <w:ind w:left="3360" w:hanging="420"/>
       </w:pPr>
     </w:lvl>
-    <w:lvl w:ilvl="8" w:tentative="0">
+    <w:lvl w:ilvl="8">
       <w:start w:val="1"/>
       <w:numFmt w:val="lowerRoman"/>
       <w:lvlText w:val="%9."/>
@@ -1453,314 +2124,429 @@
 </file>
 
 <file path=word/styles.xml><?xml version="1.0" encoding="utf-8"?>
-<w:styles xmlns:mc="http://schemas.openxmlformats.org/markup-compatibility/2006" xmlns:o="urn:schemas-microsoft-com:office:office" xmlns:r="http://schemas.openxmlformats.org/officeDocument/2006/relationships" xmlns:m="http://schemas.openxmlformats.org/officeDocument/2006/math" xmlns:v="urn:schemas-microsoft-com:vml" xmlns:w="http://schemas.openxmlformats.org/wordprocessingml/2006/main" xmlns:w14="http://schemas.microsoft.com/office/word/2010/wordml" xmlns:w10="urn:schemas-microsoft-com:office:word" xmlns:sl="http://schemas.openxmlformats.org/schemaLibrary/2006/main" xmlns:wpsCustomData="http://www.wps.cn/officeDocument/2013/wpsCustomData" mc:Ignorable="w14">
+<w:styles xmlns:mc="http://schemas.openxmlformats.org/markup-compatibility/2006" xmlns:r="http://schemas.openxmlformats.org/officeDocument/2006/relationships" xmlns:w="http://schemas.openxmlformats.org/wordprocessingml/2006/main" xmlns:w14="http://schemas.microsoft.com/office/word/2010/wordml" xmlns:w15="http://schemas.microsoft.com/office/word/2012/wordml" xmlns:w16se="http://schemas.microsoft.com/office/word/2015/wordml/symex" mc:Ignorable="w14 w15 w16se">
   <w:docDefaults>
     <w:rPrDefault>
       <w:rPr>
-        <w:rFonts w:ascii="Times New Roman" w:hAnsi="Times New Roman" w:eastAsia="宋体" w:cstheme="minorBidi"/>
+        <w:rFonts w:ascii="Times New Roman" w:eastAsia="宋体" w:hAnsi="Times New Roman" w:cstheme="minorBidi"/>
+        <w:lang w:val="en-US" w:eastAsia="zh-CN" w:bidi="ar-SA"/>
       </w:rPr>
     </w:rPrDefault>
     <w:pPrDefault/>
   </w:docDefaults>
-  <w:latentStyles w:count="260" w:defQFormat="0" w:defUnhideWhenUsed="1" w:defSemiHidden="1" w:defUIPriority="99" w:defLockedState="0">
-    <w:lsdException w:qFormat="1" w:unhideWhenUsed="0" w:uiPriority="0" w:semiHidden="0" w:name="Normal"/>
-    <w:lsdException w:qFormat="1" w:unhideWhenUsed="0" w:uiPriority="9" w:semiHidden="0" w:name="heading 1"/>
-    <w:lsdException w:qFormat="1" w:uiPriority="9" w:semiHidden="0" w:name="heading 2"/>
-    <w:lsdException w:qFormat="1" w:uiPriority="9" w:semiHidden="0" w:name="heading 3"/>
-    <w:lsdException w:qFormat="1" w:uiPriority="9" w:semiHidden="0" w:name="heading 4"/>
-    <w:lsdException w:qFormat="1" w:uiPriority="9" w:semiHidden="0" w:name="heading 5"/>
-    <w:lsdException w:qFormat="1" w:uiPriority="9" w:name="heading 6"/>
-    <w:lsdException w:qFormat="1" w:uiPriority="9" w:semiHidden="0" w:name="heading 7"/>
-    <w:lsdException w:qFormat="1" w:uiPriority="9" w:semiHidden="0" w:name="heading 8"/>
-    <w:lsdException w:qFormat="1" w:uiPriority="9" w:semiHidden="0" w:name="heading 9"/>
-    <w:lsdException w:uiPriority="99" w:name="index 1"/>
-    <w:lsdException w:uiPriority="99" w:name="index 2"/>
-    <w:lsdException w:uiPriority="99" w:name="index 3"/>
-    <w:lsdException w:uiPriority="99" w:name="index 4"/>
-    <w:lsdException w:uiPriority="99" w:name="index 5"/>
-    <w:lsdException w:uiPriority="99" w:name="index 6"/>
-    <w:lsdException w:uiPriority="99" w:name="index 7"/>
-    <w:lsdException w:uiPriority="99" w:name="index 8"/>
-    <w:lsdException w:uiPriority="99" w:name="index 9"/>
-    <w:lsdException w:uiPriority="39" w:name="toc 1"/>
-    <w:lsdException w:uiPriority="39" w:name="toc 2"/>
-    <w:lsdException w:uiPriority="39" w:name="toc 3"/>
-    <w:lsdException w:uiPriority="39" w:name="toc 4"/>
-    <w:lsdException w:uiPriority="39" w:name="toc 5"/>
-    <w:lsdException w:uiPriority="39" w:name="toc 6"/>
-    <w:lsdException w:uiPriority="39" w:name="toc 7"/>
-    <w:lsdException w:uiPriority="39" w:name="toc 8"/>
-    <w:lsdException w:uiPriority="39" w:name="toc 9"/>
-    <w:lsdException w:uiPriority="99" w:name="Normal Indent"/>
-    <w:lsdException w:uiPriority="99" w:name="footnote text"/>
-    <w:lsdException w:uiPriority="99" w:name="annotation text"/>
-    <w:lsdException w:uiPriority="99" w:name="header"/>
-    <w:lsdException w:uiPriority="99" w:name="footer"/>
-    <w:lsdException w:uiPriority="99" w:name="index heading"/>
-    <w:lsdException w:qFormat="1" w:uiPriority="35" w:name="caption"/>
-    <w:lsdException w:uiPriority="99" w:name="table of figures"/>
-    <w:lsdException w:uiPriority="99" w:name="envelope address"/>
-    <w:lsdException w:uiPriority="99" w:name="envelope return"/>
-    <w:lsdException w:uiPriority="99" w:name="footnote reference"/>
-    <w:lsdException w:uiPriority="99" w:name="annotation reference"/>
-    <w:lsdException w:uiPriority="99" w:name="line number"/>
-    <w:lsdException w:uiPriority="99" w:name="page number"/>
-    <w:lsdException w:uiPriority="99" w:name="endnote reference"/>
-    <w:lsdException w:uiPriority="99" w:name="endnote text"/>
-    <w:lsdException w:uiPriority="99" w:name="table of authorities"/>
-    <w:lsdException w:uiPriority="99" w:name="macro"/>
-    <w:lsdException w:uiPriority="99" w:name="toa heading"/>
-    <w:lsdException w:uiPriority="99" w:name="List"/>
-    <w:lsdException w:uiPriority="99" w:name="List Bullet"/>
-    <w:lsdException w:uiPriority="99" w:name="List Number"/>
-    <w:lsdException w:uiPriority="99" w:name="List 2"/>
-    <w:lsdException w:uiPriority="99" w:name="List 3"/>
-    <w:lsdException w:uiPriority="99" w:name="List 4"/>
-    <w:lsdException w:uiPriority="99" w:name="List 5"/>
-    <w:lsdException w:uiPriority="99" w:name="List Bullet 2"/>
-    <w:lsdException w:uiPriority="99" w:name="List Bullet 3"/>
-    <w:lsdException w:uiPriority="99" w:name="List Bullet 4"/>
-    <w:lsdException w:uiPriority="99" w:name="List Bullet 5"/>
-    <w:lsdException w:uiPriority="99" w:name="List Number 2"/>
-    <w:lsdException w:uiPriority="99" w:name="List Number 3"/>
-    <w:lsdException w:uiPriority="99" w:name="List Number 4"/>
-    <w:lsdException w:uiPriority="99" w:name="List Number 5"/>
-    <w:lsdException w:qFormat="1" w:unhideWhenUsed="0" w:uiPriority="10" w:semiHidden="0" w:name="Title"/>
-    <w:lsdException w:uiPriority="99" w:name="Closing"/>
-    <w:lsdException w:uiPriority="99" w:name="Signature"/>
-    <w:lsdException w:uiPriority="1" w:name="Default Paragraph Font"/>
-    <w:lsdException w:uiPriority="99" w:name="Body Text"/>
-    <w:lsdException w:uiPriority="99" w:name="Body Text Indent"/>
-    <w:lsdException w:uiPriority="99" w:name="List Continue"/>
-    <w:lsdException w:uiPriority="99" w:name="List Continue 2"/>
-    <w:lsdException w:uiPriority="99" w:name="List Continue 3"/>
-    <w:lsdException w:uiPriority="99" w:name="List Continue 4"/>
-    <w:lsdException w:uiPriority="99" w:name="List Continue 5"/>
-    <w:lsdException w:uiPriority="99" w:name="Message Header"/>
-    <w:lsdException w:qFormat="1" w:unhideWhenUsed="0" w:uiPriority="11" w:semiHidden="0" w:name="Subtitle"/>
-    <w:lsdException w:uiPriority="99" w:name="Salutation"/>
-    <w:lsdException w:uiPriority="99" w:name="Date"/>
-    <w:lsdException w:uiPriority="99" w:name="Body Text First Indent"/>
-    <w:lsdException w:uiPriority="99" w:name="Body Text First Indent 2"/>
-    <w:lsdException w:uiPriority="99" w:name="Note Heading"/>
-    <w:lsdException w:uiPriority="99" w:name="Body Text 2"/>
-    <w:lsdException w:uiPriority="99" w:name="Body Text 3"/>
-    <w:lsdException w:uiPriority="99" w:name="Body Text Indent 2"/>
-    <w:lsdException w:uiPriority="99" w:name="Body Text Indent 3"/>
-    <w:lsdException w:uiPriority="99" w:name="Block Text"/>
-    <w:lsdException w:uiPriority="99" w:name="Hyperlink"/>
-    <w:lsdException w:uiPriority="99" w:name="FollowedHyperlink"/>
-    <w:lsdException w:qFormat="1" w:unhideWhenUsed="0" w:uiPriority="22" w:semiHidden="0" w:name="Strong"/>
-    <w:lsdException w:qFormat="1" w:unhideWhenUsed="0" w:uiPriority="20" w:semiHidden="0" w:name="Emphasis"/>
-    <w:lsdException w:uiPriority="99" w:name="Document Map"/>
-    <w:lsdException w:uiPriority="99" w:name="Plain Text"/>
-    <w:lsdException w:uiPriority="99" w:name="E-mail Signature"/>
-    <w:lsdException w:uiPriority="99" w:name="Normal (Web)"/>
-    <w:lsdException w:uiPriority="99" w:name="HTML Acronym"/>
-    <w:lsdException w:uiPriority="99" w:name="HTML Address"/>
-    <w:lsdException w:uiPriority="99" w:name="HTML Cite"/>
-    <w:lsdException w:uiPriority="99" w:name="HTML Code"/>
-    <w:lsdException w:uiPriority="99" w:name="HTML Definition"/>
-    <w:lsdException w:uiPriority="99" w:name="HTML Keyboard"/>
-    <w:lsdException w:uiPriority="99" w:name="HTML Preformatted"/>
-    <w:lsdException w:uiPriority="99" w:name="HTML Sample"/>
-    <w:lsdException w:uiPriority="99" w:name="HTML Typewriter"/>
-    <w:lsdException w:uiPriority="99" w:name="HTML Variable"/>
-    <w:lsdException w:qFormat="1" w:uiPriority="99" w:name="Normal Table"/>
-    <w:lsdException w:uiPriority="99" w:name="annotation subject"/>
-    <w:lsdException w:uiPriority="99" w:name="Table Simple 1"/>
-    <w:lsdException w:uiPriority="99" w:name="Table Simple 2"/>
-    <w:lsdException w:uiPriority="99" w:name="Table Simple 3"/>
-    <w:lsdException w:uiPriority="99" w:name="Table Classic 1"/>
-    <w:lsdException w:uiPriority="99" w:name="Table Classic 2"/>
-    <w:lsdException w:uiPriority="99" w:name="Table Classic 3"/>
-    <w:lsdException w:uiPriority="99" w:name="Table Classic 4"/>
-    <w:lsdException w:uiPriority="99" w:name="Table Colorful 1"/>
-    <w:lsdException w:uiPriority="99" w:name="Table Colorful 2"/>
-    <w:lsdException w:uiPriority="99" w:name="Table Colorful 3"/>
-    <w:lsdException w:uiPriority="99" w:name="Table Columns 1"/>
-    <w:lsdException w:uiPriority="99" w:name="Table Columns 2"/>
-    <w:lsdException w:uiPriority="99" w:name="Table Columns 3"/>
-    <w:lsdException w:uiPriority="99" w:name="Table Columns 4"/>
-    <w:lsdException w:uiPriority="99" w:name="Table Columns 5"/>
-    <w:lsdException w:uiPriority="99" w:name="Table Grid 1"/>
-    <w:lsdException w:uiPriority="99" w:name="Table Grid 2"/>
-    <w:lsdException w:uiPriority="99" w:name="Table Grid 3"/>
-    <w:lsdException w:uiPriority="99" w:name="Table Grid 4"/>
-    <w:lsdException w:uiPriority="99" w:name="Table Grid 5"/>
-    <w:lsdException w:uiPriority="99" w:name="Table Grid 6"/>
-    <w:lsdException w:uiPriority="99" w:name="Table Grid 7"/>
-    <w:lsdException w:uiPriority="99" w:name="Table Grid 8"/>
-    <w:lsdException w:uiPriority="99" w:name="Table List 1"/>
-    <w:lsdException w:uiPriority="99" w:name="Table List 2"/>
-    <w:lsdException w:uiPriority="99" w:name="Table List 3"/>
-    <w:lsdException w:uiPriority="99" w:name="Table List 4"/>
-    <w:lsdException w:uiPriority="99" w:name="Table List 5"/>
-    <w:lsdException w:uiPriority="99" w:name="Table List 6"/>
-    <w:lsdException w:uiPriority="99" w:name="Table List 7"/>
-    <w:lsdException w:uiPriority="99" w:name="Table List 8"/>
-    <w:lsdException w:uiPriority="99" w:name="Table 3D effects 1"/>
-    <w:lsdException w:uiPriority="99" w:name="Table 3D effects 2"/>
-    <w:lsdException w:uiPriority="99" w:name="Table 3D effects 3"/>
-    <w:lsdException w:uiPriority="99" w:name="Table Contemporary"/>
-    <w:lsdException w:uiPriority="99" w:name="Table Elegant"/>
-    <w:lsdException w:uiPriority="99" w:name="Table Professional"/>
-    <w:lsdException w:uiPriority="99" w:name="Table Subtle 1"/>
-    <w:lsdException w:uiPriority="99" w:name="Table Subtle 2"/>
-    <w:lsdException w:uiPriority="99" w:name="Table Web 1"/>
-    <w:lsdException w:uiPriority="99" w:name="Table Web 2"/>
-    <w:lsdException w:uiPriority="99" w:name="Table Web 3"/>
-    <w:lsdException w:uiPriority="99" w:name="Balloon Text"/>
-    <w:lsdException w:unhideWhenUsed="0" w:uiPriority="39" w:semiHidden="0" w:name="Table Grid"/>
-    <w:lsdException w:uiPriority="99" w:name="Table Theme"/>
-    <w:lsdException w:unhideWhenUsed="0" w:uiPriority="60" w:semiHidden="0" w:name="Light Shading"/>
-    <w:lsdException w:unhideWhenUsed="0" w:uiPriority="61" w:semiHidden="0" w:name="Light List"/>
-    <w:lsdException w:unhideWhenUsed="0" w:uiPriority="62" w:semiHidden="0" w:name="Light Grid"/>
-    <w:lsdException w:unhideWhenUsed="0" w:uiPriority="63" w:semiHidden="0" w:name="Medium Shading 1"/>
-    <w:lsdException w:unhideWhenUsed="0" w:uiPriority="64" w:semiHidden="0" w:name="Medium Shading 2"/>
-    <w:lsdException w:unhideWhenUsed="0" w:uiPriority="65" w:semiHidden="0" w:name="Medium List 1"/>
-    <w:lsdException w:unhideWhenUsed="0" w:uiPriority="66" w:semiHidden="0" w:name="Medium List 2"/>
-    <w:lsdException w:unhideWhenUsed="0" w:uiPriority="67" w:semiHidden="0" w:name="Medium Grid 1"/>
-    <w:lsdException w:unhideWhenUsed="0" w:uiPriority="68" w:semiHidden="0" w:name="Medium Grid 2"/>
-    <w:lsdException w:unhideWhenUsed="0" w:uiPriority="69" w:semiHidden="0" w:name="Medium Grid 3"/>
-    <w:lsdException w:unhideWhenUsed="0" w:uiPriority="70" w:semiHidden="0" w:name="Dark List"/>
-    <w:lsdException w:unhideWhenUsed="0" w:uiPriority="71" w:semiHidden="0" w:name="Colorful Shading"/>
-    <w:lsdException w:unhideWhenUsed="0" w:uiPriority="72" w:semiHidden="0" w:name="Colorful List"/>
-    <w:lsdException w:unhideWhenUsed="0" w:uiPriority="73" w:semiHidden="0" w:name="Colorful Grid"/>
-    <w:lsdException w:unhideWhenUsed="0" w:uiPriority="60" w:semiHidden="0" w:name="Light Shading Accent 1"/>
-    <w:lsdException w:unhideWhenUsed="0" w:uiPriority="61" w:semiHidden="0" w:name="Light List Accent 1"/>
-    <w:lsdException w:unhideWhenUsed="0" w:uiPriority="62" w:semiHidden="0" w:name="Light Grid Accent 1"/>
-    <w:lsdException w:unhideWhenUsed="0" w:uiPriority="63" w:semiHidden="0" w:name="Medium Shading 1 Accent 1"/>
-    <w:lsdException w:unhideWhenUsed="0" w:uiPriority="64" w:semiHidden="0" w:name="Medium Shading 2 Accent 1"/>
-    <w:lsdException w:unhideWhenUsed="0" w:uiPriority="65" w:semiHidden="0" w:name="Medium List 1 Accent 1"/>
-    <w:lsdException w:qFormat="1" w:unhideWhenUsed="0" w:uiPriority="34" w:semiHidden="0" w:name="List Paragraph"/>
-    <w:lsdException w:unhideWhenUsed="0" w:uiPriority="66" w:semiHidden="0" w:name="Medium List 2 Accent 1"/>
-    <w:lsdException w:unhideWhenUsed="0" w:uiPriority="67" w:semiHidden="0" w:name="Medium Grid 1 Accent 1"/>
-    <w:lsdException w:unhideWhenUsed="0" w:uiPriority="68" w:semiHidden="0" w:name="Medium Grid 2 Accent 1"/>
-    <w:lsdException w:unhideWhenUsed="0" w:uiPriority="69" w:semiHidden="0" w:name="Medium Grid 3 Accent 1"/>
-    <w:lsdException w:unhideWhenUsed="0" w:uiPriority="70" w:semiHidden="0" w:name="Dark List Accent 1"/>
-    <w:lsdException w:unhideWhenUsed="0" w:uiPriority="71" w:semiHidden="0" w:name="Colorful Shading Accent 1"/>
-    <w:lsdException w:unhideWhenUsed="0" w:uiPriority="72" w:semiHidden="0" w:name="Colorful List Accent 1"/>
-    <w:lsdException w:unhideWhenUsed="0" w:uiPriority="73" w:semiHidden="0" w:name="Colorful Grid Accent 1"/>
-    <w:lsdException w:unhideWhenUsed="0" w:uiPriority="60" w:semiHidden="0" w:name="Light Shading Accent 2"/>
-    <w:lsdException w:unhideWhenUsed="0" w:uiPriority="61" w:semiHidden="0" w:name="Light List Accent 2"/>
-    <w:lsdException w:unhideWhenUsed="0" w:uiPriority="62" w:semiHidden="0" w:name="Light Grid Accent 2"/>
-    <w:lsdException w:unhideWhenUsed="0" w:uiPriority="63" w:semiHidden="0" w:name="Medium Shading 1 Accent 2"/>
-    <w:lsdException w:unhideWhenUsed="0" w:uiPriority="64" w:semiHidden="0" w:name="Medium Shading 2 Accent 2"/>
-    <w:lsdException w:unhideWhenUsed="0" w:uiPriority="65" w:semiHidden="0" w:name="Medium List 1 Accent 2"/>
-    <w:lsdException w:unhideWhenUsed="0" w:uiPriority="66" w:semiHidden="0" w:name="Medium List 2 Accent 2"/>
-    <w:lsdException w:unhideWhenUsed="0" w:uiPriority="67" w:semiHidden="0" w:name="Medium Grid 1 Accent 2"/>
-    <w:lsdException w:unhideWhenUsed="0" w:uiPriority="68" w:semiHidden="0" w:name="Medium Grid 2 Accent 2"/>
-    <w:lsdException w:unhideWhenUsed="0" w:uiPriority="69" w:semiHidden="0" w:name="Medium Grid 3 Accent 2"/>
-    <w:lsdException w:unhideWhenUsed="0" w:uiPriority="70" w:semiHidden="0" w:name="Dark List Accent 2"/>
-    <w:lsdException w:unhideWhenUsed="0" w:uiPriority="71" w:semiHidden="0" w:name="Colorful Shading Accent 2"/>
-    <w:lsdException w:unhideWhenUsed="0" w:uiPriority="72" w:semiHidden="0" w:name="Colorful List Accent 2"/>
-    <w:lsdException w:unhideWhenUsed="0" w:uiPriority="73" w:semiHidden="0" w:name="Colorful Grid Accent 2"/>
-    <w:lsdException w:unhideWhenUsed="0" w:uiPriority="60" w:semiHidden="0" w:name="Light Shading Accent 3"/>
-    <w:lsdException w:unhideWhenUsed="0" w:uiPriority="61" w:semiHidden="0" w:name="Light List Accent 3"/>
-    <w:lsdException w:unhideWhenUsed="0" w:uiPriority="62" w:semiHidden="0" w:name="Light Grid Accent 3"/>
-    <w:lsdException w:unhideWhenUsed="0" w:uiPriority="63" w:semiHidden="0" w:name="Medium Shading 1 Accent 3"/>
-    <w:lsdException w:unhideWhenUsed="0" w:uiPriority="64" w:semiHidden="0" w:name="Medium Shading 2 Accent 3"/>
-    <w:lsdException w:unhideWhenUsed="0" w:uiPriority="65" w:semiHidden="0" w:name="Medium List 1 Accent 3"/>
-    <w:lsdException w:unhideWhenUsed="0" w:uiPriority="66" w:semiHidden="0" w:name="Medium List 2 Accent 3"/>
-    <w:lsdException w:unhideWhenUsed="0" w:uiPriority="67" w:semiHidden="0" w:name="Medium Grid 1 Accent 3"/>
-    <w:lsdException w:unhideWhenUsed="0" w:uiPriority="68" w:semiHidden="0" w:name="Medium Grid 2 Accent 3"/>
-    <w:lsdException w:unhideWhenUsed="0" w:uiPriority="69" w:semiHidden="0" w:name="Medium Grid 3 Accent 3"/>
-    <w:lsdException w:unhideWhenUsed="0" w:uiPriority="70" w:semiHidden="0" w:name="Dark List Accent 3"/>
-    <w:lsdException w:unhideWhenUsed="0" w:uiPriority="71" w:semiHidden="0" w:name="Colorful Shading Accent 3"/>
-    <w:lsdException w:unhideWhenUsed="0" w:uiPriority="72" w:semiHidden="0" w:name="Colorful List Accent 3"/>
-    <w:lsdException w:unhideWhenUsed="0" w:uiPriority="73" w:semiHidden="0" w:name="Colorful Grid Accent 3"/>
-    <w:lsdException w:unhideWhenUsed="0" w:uiPriority="60" w:semiHidden="0" w:name="Light Shading Accent 4"/>
-    <w:lsdException w:unhideWhenUsed="0" w:uiPriority="61" w:semiHidden="0" w:name="Light List Accent 4"/>
-    <w:lsdException w:unhideWhenUsed="0" w:uiPriority="62" w:semiHidden="0" w:name="Light Grid Accent 4"/>
-    <w:lsdException w:unhideWhenUsed="0" w:uiPriority="63" w:semiHidden="0" w:name="Medium Shading 1 Accent 4"/>
-    <w:lsdException w:unhideWhenUsed="0" w:uiPriority="64" w:semiHidden="0" w:name="Medium Shading 2 Accent 4"/>
-    <w:lsdException w:unhideWhenUsed="0" w:uiPriority="65" w:semiHidden="0" w:name="Medium List 1 Accent 4"/>
-    <w:lsdException w:unhideWhenUsed="0" w:uiPriority="66" w:semiHidden="0" w:name="Medium List 2 Accent 4"/>
-    <w:lsdException w:unhideWhenUsed="0" w:uiPriority="67" w:semiHidden="0" w:name="Medium Grid 1 Accent 4"/>
-    <w:lsdException w:unhideWhenUsed="0" w:uiPriority="68" w:semiHidden="0" w:name="Medium Grid 2 Accent 4"/>
-    <w:lsdException w:unhideWhenUsed="0" w:uiPriority="69" w:semiHidden="0" w:name="Medium Grid 3 Accent 4"/>
-    <w:lsdException w:unhideWhenUsed="0" w:uiPriority="70" w:semiHidden="0" w:name="Dark List Accent 4"/>
-    <w:lsdException w:unhideWhenUsed="0" w:uiPriority="71" w:semiHidden="0" w:name="Colorful Shading Accent 4"/>
-    <w:lsdException w:unhideWhenUsed="0" w:uiPriority="72" w:semiHidden="0" w:name="Colorful List Accent 4"/>
-    <w:lsdException w:unhideWhenUsed="0" w:uiPriority="73" w:semiHidden="0" w:name="Colorful Grid Accent 4"/>
-    <w:lsdException w:unhideWhenUsed="0" w:uiPriority="60" w:semiHidden="0" w:name="Light Shading Accent 5"/>
-    <w:lsdException w:unhideWhenUsed="0" w:uiPriority="61" w:semiHidden="0" w:name="Light List Accent 5"/>
-    <w:lsdException w:unhideWhenUsed="0" w:uiPriority="62" w:semiHidden="0" w:name="Light Grid Accent 5"/>
-    <w:lsdException w:unhideWhenUsed="0" w:uiPriority="63" w:semiHidden="0" w:name="Medium Shading 1 Accent 5"/>
-    <w:lsdException w:unhideWhenUsed="0" w:uiPriority="64" w:semiHidden="0" w:name="Medium Shading 2 Accent 5"/>
-    <w:lsdException w:unhideWhenUsed="0" w:uiPriority="65" w:semiHidden="0" w:name="Medium List 1 Accent 5"/>
-    <w:lsdException w:unhideWhenUsed="0" w:uiPriority="66" w:semiHidden="0" w:name="Medium List 2 Accent 5"/>
-    <w:lsdException w:unhideWhenUsed="0" w:uiPriority="67" w:semiHidden="0" w:name="Medium Grid 1 Accent 5"/>
-    <w:lsdException w:unhideWhenUsed="0" w:uiPriority="68" w:semiHidden="0" w:name="Medium Grid 2 Accent 5"/>
-    <w:lsdException w:unhideWhenUsed="0" w:uiPriority="69" w:semiHidden="0" w:name="Medium Grid 3 Accent 5"/>
-    <w:lsdException w:unhideWhenUsed="0" w:uiPriority="70" w:semiHidden="0" w:name="Dark List Accent 5"/>
-    <w:lsdException w:unhideWhenUsed="0" w:uiPriority="71" w:semiHidden="0" w:name="Colorful Shading Accent 5"/>
-    <w:lsdException w:unhideWhenUsed="0" w:uiPriority="72" w:semiHidden="0" w:name="Colorful List Accent 5"/>
-    <w:lsdException w:unhideWhenUsed="0" w:uiPriority="73" w:semiHidden="0" w:name="Colorful Grid Accent 5"/>
-    <w:lsdException w:unhideWhenUsed="0" w:uiPriority="60" w:semiHidden="0" w:name="Light Shading Accent 6"/>
-    <w:lsdException w:unhideWhenUsed="0" w:uiPriority="61" w:semiHidden="0" w:name="Light List Accent 6"/>
-    <w:lsdException w:unhideWhenUsed="0" w:uiPriority="62" w:semiHidden="0" w:name="Light Grid Accent 6"/>
-    <w:lsdException w:unhideWhenUsed="0" w:uiPriority="63" w:semiHidden="0" w:name="Medium Shading 1 Accent 6"/>
-    <w:lsdException w:unhideWhenUsed="0" w:uiPriority="64" w:semiHidden="0" w:name="Medium Shading 2 Accent 6"/>
-    <w:lsdException w:unhideWhenUsed="0" w:uiPriority="65" w:semiHidden="0" w:name="Medium List 1 Accent 6"/>
-    <w:lsdException w:unhideWhenUsed="0" w:uiPriority="66" w:semiHidden="0" w:name="Medium List 2 Accent 6"/>
-    <w:lsdException w:unhideWhenUsed="0" w:uiPriority="67" w:semiHidden="0" w:name="Medium Grid 1 Accent 6"/>
-    <w:lsdException w:unhideWhenUsed="0" w:uiPriority="68" w:semiHidden="0" w:name="Medium Grid 2 Accent 6"/>
-    <w:lsdException w:unhideWhenUsed="0" w:uiPriority="69" w:semiHidden="0" w:name="Medium Grid 3 Accent 6"/>
-    <w:lsdException w:unhideWhenUsed="0" w:uiPriority="70" w:semiHidden="0" w:name="Dark List Accent 6"/>
-    <w:lsdException w:unhideWhenUsed="0" w:uiPriority="71" w:semiHidden="0" w:name="Colorful Shading Accent 6"/>
-    <w:lsdException w:unhideWhenUsed="0" w:uiPriority="72" w:semiHidden="0" w:name="Colorful List Accent 6"/>
-    <w:lsdException w:unhideWhenUsed="0" w:uiPriority="73" w:semiHidden="0" w:name="Colorful Grid Accent 6"/>
+  <w:latentStyles w:defLockedState="0" w:defUIPriority="99" w:defSemiHidden="0" w:defUnhideWhenUsed="0" w:defQFormat="0" w:count="371">
+    <w:lsdException w:name="Normal" w:uiPriority="0" w:qFormat="1"/>
+    <w:lsdException w:name="heading 1" w:uiPriority="9" w:qFormat="1"/>
+    <w:lsdException w:name="heading 2" w:uiPriority="9" w:unhideWhenUsed="1" w:qFormat="1"/>
+    <w:lsdException w:name="heading 3" w:uiPriority="9" w:unhideWhenUsed="1" w:qFormat="1"/>
+    <w:lsdException w:name="heading 4" w:uiPriority="9" w:unhideWhenUsed="1" w:qFormat="1"/>
+    <w:lsdException w:name="heading 5" w:uiPriority="9" w:unhideWhenUsed="1" w:qFormat="1"/>
+    <w:lsdException w:name="heading 6" w:semiHidden="1" w:uiPriority="9" w:unhideWhenUsed="1" w:qFormat="1"/>
+    <w:lsdException w:name="heading 7" w:uiPriority="9" w:unhideWhenUsed="1" w:qFormat="1"/>
+    <w:lsdException w:name="heading 8" w:uiPriority="9" w:unhideWhenUsed="1" w:qFormat="1"/>
+    <w:lsdException w:name="heading 9" w:uiPriority="9" w:unhideWhenUsed="1" w:qFormat="1"/>
+    <w:lsdException w:name="index 1" w:semiHidden="1" w:unhideWhenUsed="1"/>
+    <w:lsdException w:name="index 2" w:semiHidden="1" w:unhideWhenUsed="1"/>
+    <w:lsdException w:name="index 3" w:semiHidden="1" w:unhideWhenUsed="1"/>
+    <w:lsdException w:name="index 4" w:semiHidden="1" w:unhideWhenUsed="1"/>
+    <w:lsdException w:name="index 5" w:semiHidden="1" w:unhideWhenUsed="1"/>
+    <w:lsdException w:name="index 6" w:semiHidden="1" w:unhideWhenUsed="1"/>
+    <w:lsdException w:name="index 7" w:semiHidden="1" w:unhideWhenUsed="1"/>
+    <w:lsdException w:name="index 8" w:semiHidden="1" w:unhideWhenUsed="1"/>
+    <w:lsdException w:name="index 9" w:semiHidden="1" w:unhideWhenUsed="1"/>
+    <w:lsdException w:name="toc 1" w:semiHidden="1" w:uiPriority="39" w:unhideWhenUsed="1"/>
+    <w:lsdException w:name="toc 2" w:semiHidden="1" w:uiPriority="39" w:unhideWhenUsed="1"/>
+    <w:lsdException w:name="toc 3" w:semiHidden="1" w:uiPriority="39" w:unhideWhenUsed="1"/>
+    <w:lsdException w:name="toc 4" w:semiHidden="1" w:uiPriority="39" w:unhideWhenUsed="1"/>
+    <w:lsdException w:name="toc 5" w:semiHidden="1" w:uiPriority="39" w:unhideWhenUsed="1"/>
+    <w:lsdException w:name="toc 6" w:semiHidden="1" w:uiPriority="39" w:unhideWhenUsed="1"/>
+    <w:lsdException w:name="toc 7" w:semiHidden="1" w:uiPriority="39" w:unhideWhenUsed="1"/>
+    <w:lsdException w:name="toc 8" w:semiHidden="1" w:uiPriority="39" w:unhideWhenUsed="1"/>
+    <w:lsdException w:name="toc 9" w:semiHidden="1" w:uiPriority="39" w:unhideWhenUsed="1"/>
+    <w:lsdException w:name="Normal Indent" w:semiHidden="1" w:unhideWhenUsed="1"/>
+    <w:lsdException w:name="footnote text" w:semiHidden="1" w:unhideWhenUsed="1"/>
+    <w:lsdException w:name="annotation text" w:semiHidden="1" w:unhideWhenUsed="1"/>
+    <w:lsdException w:name="header" w:semiHidden="1" w:unhideWhenUsed="1"/>
+    <w:lsdException w:name="footer" w:semiHidden="1" w:unhideWhenUsed="1"/>
+    <w:lsdException w:name="index heading" w:semiHidden="1" w:unhideWhenUsed="1"/>
+    <w:lsdException w:name="caption" w:semiHidden="1" w:uiPriority="35" w:unhideWhenUsed="1" w:qFormat="1"/>
+    <w:lsdException w:name="table of figures" w:semiHidden="1" w:unhideWhenUsed="1"/>
+    <w:lsdException w:name="envelope address" w:semiHidden="1" w:unhideWhenUsed="1"/>
+    <w:lsdException w:name="envelope return" w:semiHidden="1" w:unhideWhenUsed="1"/>
+    <w:lsdException w:name="footnote reference" w:semiHidden="1" w:unhideWhenUsed="1"/>
+    <w:lsdException w:name="annotation reference" w:semiHidden="1" w:unhideWhenUsed="1"/>
+    <w:lsdException w:name="line number" w:semiHidden="1" w:unhideWhenUsed="1"/>
+    <w:lsdException w:name="page number" w:semiHidden="1" w:unhideWhenUsed="1"/>
+    <w:lsdException w:name="endnote reference" w:semiHidden="1" w:unhideWhenUsed="1"/>
+    <w:lsdException w:name="endnote text" w:semiHidden="1" w:unhideWhenUsed="1"/>
+    <w:lsdException w:name="table of authorities" w:semiHidden="1" w:unhideWhenUsed="1"/>
+    <w:lsdException w:name="macro" w:semiHidden="1" w:unhideWhenUsed="1"/>
+    <w:lsdException w:name="toa heading" w:semiHidden="1" w:unhideWhenUsed="1"/>
+    <w:lsdException w:name="List" w:semiHidden="1" w:unhideWhenUsed="1"/>
+    <w:lsdException w:name="List Bullet" w:semiHidden="1" w:unhideWhenUsed="1"/>
+    <w:lsdException w:name="List Number" w:semiHidden="1" w:unhideWhenUsed="1"/>
+    <w:lsdException w:name="List 2" w:semiHidden="1" w:unhideWhenUsed="1"/>
+    <w:lsdException w:name="List 3" w:semiHidden="1" w:unhideWhenUsed="1"/>
+    <w:lsdException w:name="List 4" w:semiHidden="1" w:unhideWhenUsed="1"/>
+    <w:lsdException w:name="List 5" w:semiHidden="1" w:unhideWhenUsed="1"/>
+    <w:lsdException w:name="List Bullet 2" w:semiHidden="1" w:unhideWhenUsed="1"/>
+    <w:lsdException w:name="List Bullet 3" w:semiHidden="1" w:unhideWhenUsed="1"/>
+    <w:lsdException w:name="List Bullet 4" w:semiHidden="1" w:unhideWhenUsed="1"/>
+    <w:lsdException w:name="List Bullet 5" w:semiHidden="1" w:unhideWhenUsed="1"/>
+    <w:lsdException w:name="List Number 2" w:semiHidden="1" w:unhideWhenUsed="1"/>
+    <w:lsdException w:name="List Number 3" w:semiHidden="1" w:unhideWhenUsed="1"/>
+    <w:lsdException w:name="List Number 4" w:semiHidden="1" w:unhideWhenUsed="1"/>
+    <w:lsdException w:name="List Number 5" w:semiHidden="1" w:unhideWhenUsed="1"/>
+    <w:lsdException w:name="Title" w:uiPriority="10" w:qFormat="1"/>
+    <w:lsdException w:name="Closing" w:semiHidden="1" w:unhideWhenUsed="1"/>
+    <w:lsdException w:name="Signature" w:semiHidden="1" w:unhideWhenUsed="1"/>
+    <w:lsdException w:name="Default Paragraph Font" w:semiHidden="1" w:uiPriority="1" w:unhideWhenUsed="1"/>
+    <w:lsdException w:name="Body Text" w:semiHidden="1" w:unhideWhenUsed="1"/>
+    <w:lsdException w:name="Body Text Indent" w:semiHidden="1" w:unhideWhenUsed="1"/>
+    <w:lsdException w:name="List Continue" w:semiHidden="1" w:unhideWhenUsed="1"/>
+    <w:lsdException w:name="List Continue 2" w:semiHidden="1" w:unhideWhenUsed="1"/>
+    <w:lsdException w:name="List Continue 3" w:semiHidden="1" w:unhideWhenUsed="1"/>
+    <w:lsdException w:name="List Continue 4" w:semiHidden="1" w:unhideWhenUsed="1"/>
+    <w:lsdException w:name="List Continue 5" w:semiHidden="1" w:unhideWhenUsed="1"/>
+    <w:lsdException w:name="Message Header" w:semiHidden="1" w:unhideWhenUsed="1"/>
+    <w:lsdException w:name="Subtitle" w:uiPriority="11" w:qFormat="1"/>
+    <w:lsdException w:name="Salutation" w:semiHidden="1" w:unhideWhenUsed="1"/>
+    <w:lsdException w:name="Date" w:semiHidden="1" w:unhideWhenUsed="1"/>
+    <w:lsdException w:name="Body Text First Indent" w:semiHidden="1" w:unhideWhenUsed="1"/>
+    <w:lsdException w:name="Body Text First Indent 2" w:semiHidden="1" w:unhideWhenUsed="1"/>
+    <w:lsdException w:name="Note Heading" w:semiHidden="1" w:unhideWhenUsed="1"/>
+    <w:lsdException w:name="Body Text 2" w:semiHidden="1" w:unhideWhenUsed="1"/>
+    <w:lsdException w:name="Body Text 3" w:semiHidden="1" w:unhideWhenUsed="1"/>
+    <w:lsdException w:name="Body Text Indent 2" w:semiHidden="1" w:unhideWhenUsed="1"/>
+    <w:lsdException w:name="Body Text Indent 3" w:semiHidden="1" w:unhideWhenUsed="1"/>
+    <w:lsdException w:name="Block Text" w:semiHidden="1" w:unhideWhenUsed="1"/>
+    <w:lsdException w:name="Hyperlink" w:semiHidden="1" w:unhideWhenUsed="1"/>
+    <w:lsdException w:name="FollowedHyperlink" w:semiHidden="1" w:unhideWhenUsed="1"/>
+    <w:lsdException w:name="Strong" w:uiPriority="22" w:qFormat="1"/>
+    <w:lsdException w:name="Emphasis" w:uiPriority="20" w:qFormat="1"/>
+    <w:lsdException w:name="Document Map" w:semiHidden="1" w:unhideWhenUsed="1"/>
+    <w:lsdException w:name="Plain Text" w:semiHidden="1" w:unhideWhenUsed="1"/>
+    <w:lsdException w:name="E-mail Signature" w:semiHidden="1" w:unhideWhenUsed="1"/>
+    <w:lsdException w:name="HTML Top of Form" w:semiHidden="1" w:unhideWhenUsed="1"/>
+    <w:lsdException w:name="HTML Bottom of Form" w:semiHidden="1" w:unhideWhenUsed="1"/>
+    <w:lsdException w:name="Normal (Web)" w:semiHidden="1" w:unhideWhenUsed="1"/>
+    <w:lsdException w:name="HTML Acronym" w:semiHidden="1" w:unhideWhenUsed="1"/>
+    <w:lsdException w:name="HTML Address" w:semiHidden="1" w:unhideWhenUsed="1"/>
+    <w:lsdException w:name="HTML Cite" w:semiHidden="1" w:unhideWhenUsed="1"/>
+    <w:lsdException w:name="HTML Code" w:semiHidden="1" w:unhideWhenUsed="1"/>
+    <w:lsdException w:name="HTML Definition" w:semiHidden="1" w:unhideWhenUsed="1"/>
+    <w:lsdException w:name="HTML Keyboard" w:semiHidden="1" w:unhideWhenUsed="1"/>
+    <w:lsdException w:name="HTML Preformatted" w:semiHidden="1" w:unhideWhenUsed="1"/>
+    <w:lsdException w:name="HTML Sample" w:semiHidden="1" w:unhideWhenUsed="1"/>
+    <w:lsdException w:name="HTML Typewriter" w:semiHidden="1" w:unhideWhenUsed="1"/>
+    <w:lsdException w:name="HTML Variable" w:semiHidden="1" w:unhideWhenUsed="1"/>
+    <w:lsdException w:name="Normal Table" w:semiHidden="1" w:unhideWhenUsed="1" w:qFormat="1"/>
+    <w:lsdException w:name="annotation subject" w:semiHidden="1" w:unhideWhenUsed="1"/>
+    <w:lsdException w:name="No List" w:semiHidden="1" w:unhideWhenUsed="1"/>
+    <w:lsdException w:name="Outline List 1" w:semiHidden="1" w:unhideWhenUsed="1"/>
+    <w:lsdException w:name="Outline List 2" w:semiHidden="1" w:unhideWhenUsed="1"/>
+    <w:lsdException w:name="Outline List 3" w:semiHidden="1" w:unhideWhenUsed="1"/>
+    <w:lsdException w:name="Table Simple 1" w:semiHidden="1" w:unhideWhenUsed="1"/>
+    <w:lsdException w:name="Table Simple 2" w:semiHidden="1" w:unhideWhenUsed="1"/>
+    <w:lsdException w:name="Table Simple 3" w:semiHidden="1" w:unhideWhenUsed="1"/>
+    <w:lsdException w:name="Table Classic 1" w:semiHidden="1" w:unhideWhenUsed="1"/>
+    <w:lsdException w:name="Table Classic 2" w:semiHidden="1" w:unhideWhenUsed="1"/>
+    <w:lsdException w:name="Table Classic 3" w:semiHidden="1" w:unhideWhenUsed="1"/>
+    <w:lsdException w:name="Table Classic 4" w:semiHidden="1" w:unhideWhenUsed="1"/>
+    <w:lsdException w:name="Table Colorful 1" w:semiHidden="1" w:unhideWhenUsed="1"/>
+    <w:lsdException w:name="Table Colorful 2" w:semiHidden="1" w:unhideWhenUsed="1"/>
+    <w:lsdException w:name="Table Colorful 3" w:semiHidden="1" w:unhideWhenUsed="1"/>
+    <w:lsdException w:name="Table Columns 1" w:semiHidden="1" w:unhideWhenUsed="1"/>
+    <w:lsdException w:name="Table Columns 2" w:semiHidden="1" w:unhideWhenUsed="1"/>
+    <w:lsdException w:name="Table Columns 3" w:semiHidden="1" w:unhideWhenUsed="1"/>
+    <w:lsdException w:name="Table Columns 4" w:semiHidden="1" w:unhideWhenUsed="1"/>
+    <w:lsdException w:name="Table Columns 5" w:semiHidden="1" w:unhideWhenUsed="1"/>
+    <w:lsdException w:name="Table Grid 1" w:semiHidden="1" w:unhideWhenUsed="1"/>
+    <w:lsdException w:name="Table Grid 2" w:semiHidden="1" w:unhideWhenUsed="1"/>
+    <w:lsdException w:name="Table Grid 3" w:semiHidden="1" w:unhideWhenUsed="1"/>
+    <w:lsdException w:name="Table Grid 4" w:semiHidden="1" w:unhideWhenUsed="1"/>
+    <w:lsdException w:name="Table Grid 5" w:semiHidden="1" w:unhideWhenUsed="1"/>
+    <w:lsdException w:name="Table Grid 6" w:semiHidden="1" w:unhideWhenUsed="1"/>
+    <w:lsdException w:name="Table Grid 7" w:semiHidden="1" w:unhideWhenUsed="1"/>
+    <w:lsdException w:name="Table Grid 8" w:semiHidden="1" w:unhideWhenUsed="1"/>
+    <w:lsdException w:name="Table List 1" w:semiHidden="1" w:unhideWhenUsed="1"/>
+    <w:lsdException w:name="Table List 2" w:semiHidden="1" w:unhideWhenUsed="1"/>
+    <w:lsdException w:name="Table List 3" w:semiHidden="1" w:unhideWhenUsed="1"/>
+    <w:lsdException w:name="Table List 4" w:semiHidden="1" w:unhideWhenUsed="1"/>
+    <w:lsdException w:name="Table List 5" w:semiHidden="1" w:unhideWhenUsed="1"/>
+    <w:lsdException w:name="Table List 6" w:semiHidden="1" w:unhideWhenUsed="1"/>
+    <w:lsdException w:name="Table List 7" w:semiHidden="1" w:unhideWhenUsed="1"/>
+    <w:lsdException w:name="Table List 8" w:semiHidden="1" w:unhideWhenUsed="1"/>
+    <w:lsdException w:name="Table 3D effects 1" w:semiHidden="1" w:unhideWhenUsed="1"/>
+    <w:lsdException w:name="Table 3D effects 2" w:semiHidden="1" w:unhideWhenUsed="1"/>
+    <w:lsdException w:name="Table 3D effects 3" w:semiHidden="1" w:unhideWhenUsed="1"/>
+    <w:lsdException w:name="Table Contemporary" w:semiHidden="1" w:unhideWhenUsed="1"/>
+    <w:lsdException w:name="Table Elegant" w:semiHidden="1" w:unhideWhenUsed="1"/>
+    <w:lsdException w:name="Table Professional" w:semiHidden="1" w:unhideWhenUsed="1"/>
+    <w:lsdException w:name="Table Subtle 1" w:semiHidden="1" w:unhideWhenUsed="1"/>
+    <w:lsdException w:name="Table Subtle 2" w:semiHidden="1" w:unhideWhenUsed="1"/>
+    <w:lsdException w:name="Table Web 1" w:semiHidden="1" w:unhideWhenUsed="1"/>
+    <w:lsdException w:name="Table Web 2" w:semiHidden="1" w:unhideWhenUsed="1"/>
+    <w:lsdException w:name="Table Web 3" w:semiHidden="1" w:unhideWhenUsed="1"/>
+    <w:lsdException w:name="Balloon Text" w:semiHidden="1" w:unhideWhenUsed="1"/>
+    <w:lsdException w:name="Table Grid" w:semiHidden="1" w:uiPriority="39" w:unhideWhenUsed="1"/>
+    <w:lsdException w:name="Table Theme" w:semiHidden="1" w:unhideWhenUsed="1"/>
+    <w:lsdException w:name="Placeholder Text" w:semiHidden="1"/>
+    <w:lsdException w:name="Light Shading" w:uiPriority="60"/>
+    <w:lsdException w:name="Light List" w:uiPriority="61"/>
+    <w:lsdException w:name="Light Grid" w:uiPriority="62"/>
+    <w:lsdException w:name="Medium Shading 1" w:uiPriority="63"/>
+    <w:lsdException w:name="Medium Shading 2" w:uiPriority="64"/>
+    <w:lsdException w:name="Medium List 1" w:uiPriority="65"/>
+    <w:lsdException w:name="Medium List 2" w:uiPriority="66"/>
+    <w:lsdException w:name="Medium Grid 1" w:uiPriority="67"/>
+    <w:lsdException w:name="Medium Grid 2" w:uiPriority="68"/>
+    <w:lsdException w:name="Medium Grid 3" w:uiPriority="69"/>
+    <w:lsdException w:name="Dark List" w:uiPriority="70"/>
+    <w:lsdException w:name="Colorful Shading" w:uiPriority="71"/>
+    <w:lsdException w:name="Colorful List" w:uiPriority="72"/>
+    <w:lsdException w:name="Colorful Grid" w:uiPriority="73"/>
+    <w:lsdException w:name="Light Shading Accent 1" w:uiPriority="60"/>
+    <w:lsdException w:name="Light List Accent 1" w:uiPriority="61"/>
+    <w:lsdException w:name="Light Grid Accent 1" w:uiPriority="62"/>
+    <w:lsdException w:name="Medium Shading 1 Accent 1" w:uiPriority="63"/>
+    <w:lsdException w:name="Medium Shading 2 Accent 1" w:uiPriority="64"/>
+    <w:lsdException w:name="Medium List 1 Accent 1" w:uiPriority="65"/>
+    <w:lsdException w:name="Revision" w:semiHidden="1"/>
+    <w:lsdException w:name="List Paragraph" w:uiPriority="34" w:qFormat="1"/>
+    <w:lsdException w:name="Medium List 2 Accent 1" w:uiPriority="66"/>
+    <w:lsdException w:name="Medium Grid 1 Accent 1" w:uiPriority="67"/>
+    <w:lsdException w:name="Medium Grid 2 Accent 1" w:uiPriority="68"/>
+    <w:lsdException w:name="Medium Grid 3 Accent 1" w:uiPriority="69"/>
+    <w:lsdException w:name="Dark List Accent 1" w:uiPriority="70"/>
+    <w:lsdException w:name="Colorful Shading Accent 1" w:uiPriority="71"/>
+    <w:lsdException w:name="Colorful List Accent 1" w:uiPriority="72"/>
+    <w:lsdException w:name="Colorful Grid Accent 1" w:uiPriority="73"/>
+    <w:lsdException w:name="Light Shading Accent 2" w:uiPriority="60"/>
+    <w:lsdException w:name="Light List Accent 2" w:uiPriority="61"/>
+    <w:lsdException w:name="Light Grid Accent 2" w:uiPriority="62"/>
+    <w:lsdException w:name="Medium Shading 1 Accent 2" w:uiPriority="63"/>
+    <w:lsdException w:name="Medium Shading 2 Accent 2" w:uiPriority="64"/>
+    <w:lsdException w:name="Medium List 1 Accent 2" w:uiPriority="65"/>
+    <w:lsdException w:name="Medium List 2 Accent 2" w:uiPriority="66"/>
+    <w:lsdException w:name="Medium Grid 1 Accent 2" w:uiPriority="67"/>
+    <w:lsdException w:name="Medium Grid 2 Accent 2" w:uiPriority="68"/>
+    <w:lsdException w:name="Medium Grid 3 Accent 2" w:uiPriority="69"/>
+    <w:lsdException w:name="Dark List Accent 2" w:uiPriority="70"/>
+    <w:lsdException w:name="Colorful Shading Accent 2" w:uiPriority="71"/>
+    <w:lsdException w:name="Colorful List Accent 2" w:uiPriority="72"/>
+    <w:lsdException w:name="Colorful Grid Accent 2" w:uiPriority="73"/>
+    <w:lsdException w:name="Light Shading Accent 3" w:uiPriority="60"/>
+    <w:lsdException w:name="Light List Accent 3" w:uiPriority="61"/>
+    <w:lsdException w:name="Light Grid Accent 3" w:uiPriority="62"/>
+    <w:lsdException w:name="Medium Shading 1 Accent 3" w:uiPriority="63"/>
+    <w:lsdException w:name="Medium Shading 2 Accent 3" w:uiPriority="64"/>
+    <w:lsdException w:name="Medium List 1 Accent 3" w:uiPriority="65"/>
+    <w:lsdException w:name="Medium List 2 Accent 3" w:uiPriority="66"/>
+    <w:lsdException w:name="Medium Grid 1 Accent 3" w:uiPriority="67"/>
+    <w:lsdException w:name="Medium Grid 2 Accent 3" w:uiPriority="68"/>
+    <w:lsdException w:name="Medium Grid 3 Accent 3" w:uiPriority="69"/>
+    <w:lsdException w:name="Dark List Accent 3" w:uiPriority="70"/>
+    <w:lsdException w:name="Colorful Shading Accent 3" w:uiPriority="71"/>
+    <w:lsdException w:name="Colorful List Accent 3" w:uiPriority="72"/>
+    <w:lsdException w:name="Colorful Grid Accent 3" w:uiPriority="73"/>
+    <w:lsdException w:name="Light Shading Accent 4" w:uiPriority="60"/>
+    <w:lsdException w:name="Light List Accent 4" w:uiPriority="61"/>
+    <w:lsdException w:name="Light Grid Accent 4" w:uiPriority="62"/>
+    <w:lsdException w:name="Medium Shading 1 Accent 4" w:uiPriority="63"/>
+    <w:lsdException w:name="Medium Shading 2 Accent 4" w:uiPriority="64"/>
+    <w:lsdException w:name="Medium List 1 Accent 4" w:uiPriority="65"/>
+    <w:lsdException w:name="Medium List 2 Accent 4" w:uiPriority="66"/>
+    <w:lsdException w:name="Medium Grid 1 Accent 4" w:uiPriority="67"/>
+    <w:lsdException w:name="Medium Grid 2 Accent 4" w:uiPriority="68"/>
+    <w:lsdException w:name="Medium Grid 3 Accent 4" w:uiPriority="69"/>
+    <w:lsdException w:name="Dark List Accent 4" w:uiPriority="70"/>
+    <w:lsdException w:name="Colorful Shading Accent 4" w:uiPriority="71"/>
+    <w:lsdException w:name="Colorful List Accent 4" w:uiPriority="72"/>
+    <w:lsdException w:name="Colorful Grid Accent 4" w:uiPriority="73"/>
+    <w:lsdException w:name="Light Shading Accent 5" w:uiPriority="60"/>
+    <w:lsdException w:name="Light List Accent 5" w:uiPriority="61"/>
+    <w:lsdException w:name="Light Grid Accent 5" w:uiPriority="62"/>
+    <w:lsdException w:name="Medium Shading 1 Accent 5" w:uiPriority="63"/>
+    <w:lsdException w:name="Medium Shading 2 Accent 5" w:uiPriority="64"/>
+    <w:lsdException w:name="Medium List 1 Accent 5" w:uiPriority="65"/>
+    <w:lsdException w:name="Medium List 2 Accent 5" w:uiPriority="66"/>
+    <w:lsdException w:name="Medium Grid 1 Accent 5" w:uiPriority="67"/>
+    <w:lsdException w:name="Medium Grid 2 Accent 5" w:uiPriority="68"/>
+    <w:lsdException w:name="Medium Grid 3 Accent 5" w:uiPriority="69"/>
+    <w:lsdException w:name="Dark List Accent 5" w:uiPriority="70"/>
+    <w:lsdException w:name="Colorful Shading Accent 5" w:uiPriority="71"/>
+    <w:lsdException w:name="Colorful List Accent 5" w:uiPriority="72"/>
+    <w:lsdException w:name="Colorful Grid Accent 5" w:uiPriority="73"/>
+    <w:lsdException w:name="Light Shading Accent 6" w:uiPriority="60"/>
+    <w:lsdException w:name="Light List Accent 6" w:uiPriority="61"/>
+    <w:lsdException w:name="Light Grid Accent 6" w:uiPriority="62"/>
+    <w:lsdException w:name="Medium Shading 1 Accent 6" w:uiPriority="63"/>
+    <w:lsdException w:name="Medium Shading 2 Accent 6" w:uiPriority="64"/>
+    <w:lsdException w:name="Medium List 1 Accent 6" w:uiPriority="65"/>
+    <w:lsdException w:name="Medium List 2 Accent 6" w:uiPriority="66"/>
+    <w:lsdException w:name="Medium Grid 1 Accent 6" w:uiPriority="67"/>
+    <w:lsdException w:name="Medium Grid 2 Accent 6" w:uiPriority="68"/>
+    <w:lsdException w:name="Medium Grid 3 Accent 6" w:uiPriority="69"/>
+    <w:lsdException w:name="Dark List Accent 6" w:uiPriority="70"/>
+    <w:lsdException w:name="Colorful Shading Accent 6" w:uiPriority="71"/>
+    <w:lsdException w:name="Colorful List Accent 6" w:uiPriority="72"/>
+    <w:lsdException w:name="Colorful Grid Accent 6" w:uiPriority="73"/>
+    <w:lsdException w:name="Subtle Emphasis" w:uiPriority="19" w:qFormat="1"/>
+    <w:lsdException w:name="Intense Emphasis" w:uiPriority="21" w:qFormat="1"/>
+    <w:lsdException w:name="Subtle Reference" w:uiPriority="31" w:qFormat="1"/>
+    <w:lsdException w:name="Intense Reference" w:uiPriority="32" w:qFormat="1"/>
+    <w:lsdException w:name="Book Title" w:uiPriority="33" w:qFormat="1"/>
+    <w:lsdException w:name="Bibliography" w:semiHidden="1" w:uiPriority="37" w:unhideWhenUsed="1"/>
+    <w:lsdException w:name="TOC Heading" w:semiHidden="1" w:uiPriority="39" w:unhideWhenUsed="1" w:qFormat="1"/>
+    <w:lsdException w:name="Plain Table 1" w:uiPriority="41"/>
+    <w:lsdException w:name="Plain Table 2" w:uiPriority="42"/>
+    <w:lsdException w:name="Plain Table 3" w:uiPriority="43"/>
+    <w:lsdException w:name="Plain Table 4" w:uiPriority="44"/>
+    <w:lsdException w:name="Plain Table 5" w:uiPriority="45"/>
+    <w:lsdException w:name="Grid Table Light" w:uiPriority="40"/>
+    <w:lsdException w:name="Grid Table 1 Light" w:uiPriority="46"/>
+    <w:lsdException w:name="Grid Table 2" w:uiPriority="47"/>
+    <w:lsdException w:name="Grid Table 3" w:uiPriority="48"/>
+    <w:lsdException w:name="Grid Table 4" w:uiPriority="49"/>
+    <w:lsdException w:name="Grid Table 5 Dark" w:uiPriority="50"/>
+    <w:lsdException w:name="Grid Table 6 Colorful" w:uiPriority="51"/>
+    <w:lsdException w:name="Grid Table 7 Colorful" w:uiPriority="52"/>
+    <w:lsdException w:name="Grid Table 1 Light Accent 1" w:uiPriority="46"/>
+    <w:lsdException w:name="Grid Table 2 Accent 1" w:uiPriority="47"/>
+    <w:lsdException w:name="Grid Table 3 Accent 1" w:uiPriority="48"/>
+    <w:lsdException w:name="Grid Table 4 Accent 1" w:uiPriority="49"/>
+    <w:lsdException w:name="Grid Table 5 Dark Accent 1" w:uiPriority="50"/>
+    <w:lsdException w:name="Grid Table 6 Colorful Accent 1" w:uiPriority="51"/>
+    <w:lsdException w:name="Grid Table 7 Colorful Accent 1" w:uiPriority="52"/>
+    <w:lsdException w:name="Grid Table 1 Light Accent 2" w:uiPriority="46"/>
+    <w:lsdException w:name="Grid Table 2 Accent 2" w:uiPriority="47"/>
+    <w:lsdException w:name="Grid Table 3 Accent 2" w:uiPriority="48"/>
+    <w:lsdException w:name="Grid Table 4 Accent 2" w:uiPriority="49"/>
+    <w:lsdException w:name="Grid Table 5 Dark Accent 2" w:uiPriority="50"/>
+    <w:lsdException w:name="Grid Table 6 Colorful Accent 2" w:uiPriority="51"/>
+    <w:lsdException w:name="Grid Table 7 Colorful Accent 2" w:uiPriority="52"/>
+    <w:lsdException w:name="Grid Table 1 Light Accent 3" w:uiPriority="46"/>
+    <w:lsdException w:name="Grid Table 2 Accent 3" w:uiPriority="47"/>
+    <w:lsdException w:name="Grid Table 3 Accent 3" w:uiPriority="48"/>
+    <w:lsdException w:name="Grid Table 4 Accent 3" w:uiPriority="49"/>
+    <w:lsdException w:name="Grid Table 5 Dark Accent 3" w:uiPriority="50"/>
+    <w:lsdException w:name="Grid Table 6 Colorful Accent 3" w:uiPriority="51"/>
+    <w:lsdException w:name="Grid Table 7 Colorful Accent 3" w:uiPriority="52"/>
+    <w:lsdException w:name="Grid Table 1 Light Accent 4" w:uiPriority="46"/>
+    <w:lsdException w:name="Grid Table 2 Accent 4" w:uiPriority="47"/>
+    <w:lsdException w:name="Grid Table 3 Accent 4" w:uiPriority="48"/>
+    <w:lsdException w:name="Grid Table 4 Accent 4" w:uiPriority="49"/>
+    <w:lsdException w:name="Grid Table 5 Dark Accent 4" w:uiPriority="50"/>
+    <w:lsdException w:name="Grid Table 6 Colorful Accent 4" w:uiPriority="51"/>
+    <w:lsdException w:name="Grid Table 7 Colorful Accent 4" w:uiPriority="52"/>
+    <w:lsdException w:name="Grid Table 1 Light Accent 5" w:uiPriority="46"/>
+    <w:lsdException w:name="Grid Table 2 Accent 5" w:uiPriority="47"/>
+    <w:lsdException w:name="Grid Table 3 Accent 5" w:uiPriority="48"/>
+    <w:lsdException w:name="Grid Table 4 Accent 5" w:uiPriority="49"/>
+    <w:lsdException w:name="Grid Table 5 Dark Accent 5" w:uiPriority="50"/>
+    <w:lsdException w:name="Grid Table 6 Colorful Accent 5" w:uiPriority="51"/>
+    <w:lsdException w:name="Grid Table 7 Colorful Accent 5" w:uiPriority="52"/>
+    <w:lsdException w:name="Grid Table 1 Light Accent 6" w:uiPriority="46"/>
+    <w:lsdException w:name="Grid Table 2 Accent 6" w:uiPriority="47"/>
+    <w:lsdException w:name="Grid Table 3 Accent 6" w:uiPriority="48"/>
+    <w:lsdException w:name="Grid Table 4 Accent 6" w:uiPriority="49"/>
+    <w:lsdException w:name="Grid Table 5 Dark Accent 6" w:uiPriority="50"/>
+    <w:lsdException w:name="Grid Table 6 Colorful Accent 6" w:uiPriority="51"/>
+    <w:lsdException w:name="Grid Table 7 Colorful Accent 6" w:uiPriority="52"/>
+    <w:lsdException w:name="List Table 1 Light" w:uiPriority="46"/>
+    <w:lsdException w:name="List Table 2" w:uiPriority="47"/>
+    <w:lsdException w:name="List Table 3" w:uiPriority="48"/>
+    <w:lsdException w:name="List Table 4" w:uiPriority="49"/>
+    <w:lsdException w:name="List Table 5 Dark" w:uiPriority="50"/>
+    <w:lsdException w:name="List Table 6 Colorful" w:uiPriority="51"/>
+    <w:lsdException w:name="List Table 7 Colorful" w:uiPriority="52"/>
+    <w:lsdException w:name="List Table 1 Light Accent 1" w:uiPriority="46"/>
+    <w:lsdException w:name="List Table 2 Accent 1" w:uiPriority="47"/>
+    <w:lsdException w:name="List Table 3 Accent 1" w:uiPriority="48"/>
+    <w:lsdException w:name="List Table 4 Accent 1" w:uiPriority="49"/>
+    <w:lsdException w:name="List Table 5 Dark Accent 1" w:uiPriority="50"/>
+    <w:lsdException w:name="List Table 6 Colorful Accent 1" w:uiPriority="51"/>
+    <w:lsdException w:name="List Table 7 Colorful Accent 1" w:uiPriority="52"/>
+    <w:lsdException w:name="List Table 1 Light Accent 2" w:uiPriority="46"/>
+    <w:lsdException w:name="List Table 2 Accent 2" w:uiPriority="47"/>
+    <w:lsdException w:name="List Table 3 Accent 2" w:uiPriority="48"/>
+    <w:lsdException w:name="List Table 4 Accent 2" w:uiPriority="49"/>
+    <w:lsdException w:name="List Table 5 Dark Accent 2" w:uiPriority="50"/>
+    <w:lsdException w:name="List Table 6 Colorful Accent 2" w:uiPriority="51"/>
+    <w:lsdException w:name="List Table 7 Colorful Accent 2" w:uiPriority="52"/>
+    <w:lsdException w:name="List Table 1 Light Accent 3" w:uiPriority="46"/>
+    <w:lsdException w:name="List Table 2 Accent 3" w:uiPriority="47"/>
+    <w:lsdException w:name="List Table 3 Accent 3" w:uiPriority="48"/>
+    <w:lsdException w:name="List Table 4 Accent 3" w:uiPriority="49"/>
+    <w:lsdException w:name="List Table 5 Dark Accent 3" w:uiPriority="50"/>
+    <w:lsdException w:name="List Table 6 Colorful Accent 3" w:uiPriority="51"/>
+    <w:lsdException w:name="List Table 7 Colorful Accent 3" w:uiPriority="52"/>
+    <w:lsdException w:name="List Table 1 Light Accent 4" w:uiPriority="46"/>
+    <w:lsdException w:name="List Table 2 Accent 4" w:uiPriority="47"/>
+    <w:lsdException w:name="List Table 3 Accent 4" w:uiPriority="48"/>
+    <w:lsdException w:name="List Table 4 Accent 4" w:uiPriority="49"/>
+    <w:lsdException w:name="List Table 5 Dark Accent 4" w:uiPriority="50"/>
+    <w:lsdException w:name="List Table 6 Colorful Accent 4" w:uiPriority="51"/>
+    <w:lsdException w:name="List Table 7 Colorful Accent 4" w:uiPriority="52"/>
+    <w:lsdException w:name="List Table 1 Light Accent 5" w:uiPriority="46"/>
+    <w:lsdException w:name="List Table 2 Accent 5" w:uiPriority="47"/>
+    <w:lsdException w:name="List Table 3 Accent 5" w:uiPriority="48"/>
+    <w:lsdException w:name="List Table 4 Accent 5" w:uiPriority="49"/>
+    <w:lsdException w:name="List Table 5 Dark Accent 5" w:uiPriority="50"/>
+    <w:lsdException w:name="List Table 6 Colorful Accent 5" w:uiPriority="51"/>
+    <w:lsdException w:name="List Table 7 Colorful Accent 5" w:uiPriority="52"/>
+    <w:lsdException w:name="List Table 1 Light Accent 6" w:uiPriority="46"/>
+    <w:lsdException w:name="List Table 2 Accent 6" w:uiPriority="47"/>
+    <w:lsdException w:name="List Table 3 Accent 6" w:uiPriority="48"/>
+    <w:lsdException w:name="List Table 4 Accent 6" w:uiPriority="49"/>
+    <w:lsdException w:name="List Table 5 Dark Accent 6" w:uiPriority="50"/>
+    <w:lsdException w:name="List Table 6 Colorful Accent 6" w:uiPriority="51"/>
+    <w:lsdException w:name="List Table 7 Colorful Accent 6" w:uiPriority="52"/>
   </w:latentStyles>
-  <w:style w:type="paragraph" w:default="1" w:styleId="1">
+  <w:style w:type="paragraph" w:default="1" w:styleId="a">
     <w:name w:val="Normal"/>
     <w:qFormat/>
-    <w:uiPriority w:val="0"/>
     <w:pPr>
       <w:widowControl w:val="0"/>
       <w:spacing w:line="360" w:lineRule="auto"/>
       <w:jc w:val="both"/>
     </w:pPr>
     <w:rPr>
-      <w:rFonts w:ascii="Times New Roman" w:hAnsi="Times New Roman" w:eastAsia="宋体" w:cstheme="minorBidi"/>
       <w:kern w:val="2"/>
       <w:sz w:val="24"/>
       <w:szCs w:val="22"/>
-      <w:lang w:val="en-US" w:eastAsia="zh-CN" w:bidi="ar-SA"/>
     </w:rPr>
   </w:style>
-  <w:style w:type="paragraph" w:styleId="2">
+  <w:style w:type="paragraph" w:styleId="1">
     <w:name w:val="heading 1"/>
-    <w:link w:val="13"/>
+    <w:link w:val="10"/>
+    <w:uiPriority w:val="9"/>
     <w:qFormat/>
-    <w:uiPriority w:val="9"/>
     <w:pPr>
       <w:keepNext/>
       <w:keepLines/>
       <w:numPr>
-        <w:ilvl w:val="0"/>
         <w:numId w:val="1"/>
       </w:numPr>
       <w:spacing w:before="120" w:after="120"/>
       <w:outlineLvl w:val="0"/>
     </w:pPr>
     <w:rPr>
-      <w:rFonts w:ascii="Arial Unicode MS" w:hAnsi="Arial Unicode MS" w:eastAsia="宋体" w:cstheme="minorBidi"/>
+      <w:rFonts w:ascii="Arial Unicode MS" w:hAnsi="Arial Unicode MS"/>
       <w:b/>
       <w:bCs/>
       <w:kern w:val="44"/>
       <w:sz w:val="44"/>
       <w:szCs w:val="44"/>
-      <w:lang w:val="en-US" w:eastAsia="zh-CN" w:bidi="ar-SA"/>
     </w:rPr>
   </w:style>
-  <w:style w:type="paragraph" w:styleId="3">
+  <w:style w:type="paragraph" w:styleId="2">
     <w:name w:val="heading 2"/>
-    <w:link w:val="14"/>
+    <w:link w:val="20"/>
+    <w:uiPriority w:val="9"/>
     <w:unhideWhenUsed/>
     <w:qFormat/>
-    <w:uiPriority w:val="9"/>
     <w:pPr>
       <w:keepNext/>
       <w:keepLines/>
@@ -1772,22 +2558,21 @@
       <w:outlineLvl w:val="1"/>
     </w:pPr>
     <w:rPr>
-      <w:rFonts w:ascii="Arial Unicode MS" w:hAnsi="Arial Unicode MS" w:eastAsia="宋体" w:cstheme="majorBidi"/>
+      <w:rFonts w:ascii="Arial Unicode MS" w:hAnsi="Arial Unicode MS" w:cstheme="majorBidi"/>
       <w:b/>
       <w:bCs/>
       <w:kern w:val="2"/>
       <w:sz w:val="32"/>
       <w:szCs w:val="32"/>
-      <w:lang w:val="en-US" w:eastAsia="zh-CN" w:bidi="ar-SA"/>
     </w:rPr>
   </w:style>
-  <w:style w:type="paragraph" w:styleId="4">
+  <w:style w:type="paragraph" w:styleId="3">
     <w:name w:val="heading 3"/>
-    <w:link w:val="15"/>
+    <w:link w:val="30"/>
     <w:autoRedefine/>
+    <w:uiPriority w:val="9"/>
     <w:unhideWhenUsed/>
     <w:qFormat/>
-    <w:uiPriority w:val="9"/>
     <w:pPr>
       <w:keepNext/>
       <w:keepLines/>
@@ -1799,22 +2584,21 @@
       <w:outlineLvl w:val="2"/>
     </w:pPr>
     <w:rPr>
-      <w:rFonts w:ascii="Arial Unicode MS" w:hAnsi="Arial Unicode MS" w:eastAsia="宋体" w:cstheme="minorBidi"/>
+      <w:rFonts w:ascii="Arial Unicode MS" w:hAnsi="Arial Unicode MS"/>
       <w:b/>
       <w:bCs/>
       <w:kern w:val="2"/>
       <w:sz w:val="32"/>
       <w:szCs w:val="32"/>
-      <w:lang w:val="en-US" w:eastAsia="zh-CN" w:bidi="ar-SA"/>
     </w:rPr>
   </w:style>
-  <w:style w:type="paragraph" w:styleId="5">
+  <w:style w:type="paragraph" w:styleId="4">
     <w:name w:val="heading 4"/>
-    <w:basedOn w:val="1"/>
-    <w:link w:val="20"/>
+    <w:basedOn w:val="a"/>
+    <w:link w:val="40"/>
+    <w:uiPriority w:val="9"/>
     <w:unhideWhenUsed/>
     <w:qFormat/>
-    <w:uiPriority w:val="9"/>
     <w:pPr>
       <w:keepNext/>
       <w:keepLines/>
@@ -1833,12 +2617,12 @@
       <w:szCs w:val="28"/>
     </w:rPr>
   </w:style>
-  <w:style w:type="paragraph" w:styleId="6">
+  <w:style w:type="paragraph" w:styleId="5">
     <w:name w:val="heading 5"/>
-    <w:link w:val="16"/>
+    <w:link w:val="50"/>
+    <w:uiPriority w:val="9"/>
     <w:unhideWhenUsed/>
     <w:qFormat/>
-    <w:uiPriority w:val="9"/>
     <w:pPr>
       <w:keepNext/>
       <w:keepLines/>
@@ -1850,22 +2634,21 @@
       <w:outlineLvl w:val="4"/>
     </w:pPr>
     <w:rPr>
-      <w:rFonts w:ascii="Arial Unicode MS" w:hAnsi="Arial Unicode MS" w:eastAsia="宋体" w:cstheme="minorBidi"/>
+      <w:rFonts w:ascii="Arial Unicode MS" w:hAnsi="Arial Unicode MS"/>
       <w:b/>
       <w:bCs/>
       <w:kern w:val="2"/>
       <w:sz w:val="28"/>
       <w:szCs w:val="28"/>
-      <w:lang w:val="en-US" w:eastAsia="zh-CN" w:bidi="ar-SA"/>
     </w:rPr>
   </w:style>
-  <w:style w:type="paragraph" w:styleId="7">
+  <w:style w:type="paragraph" w:styleId="6">
     <w:name w:val="heading 6"/>
-    <w:link w:val="17"/>
+    <w:link w:val="60"/>
+    <w:uiPriority w:val="9"/>
     <w:semiHidden/>
     <w:unhideWhenUsed/>
     <w:qFormat/>
-    <w:uiPriority w:val="9"/>
     <w:pPr>
       <w:keepNext/>
       <w:keepLines/>
@@ -1876,21 +2659,20 @@
       <w:outlineLvl w:val="5"/>
     </w:pPr>
     <w:rPr>
-      <w:rFonts w:eastAsia="宋体" w:asciiTheme="majorHAnsi" w:hAnsiTheme="majorHAnsi" w:cstheme="majorBidi"/>
+      <w:rFonts w:asciiTheme="majorHAnsi" w:hAnsiTheme="majorHAnsi" w:cstheme="majorBidi"/>
       <w:b/>
       <w:bCs/>
       <w:kern w:val="2"/>
       <w:sz w:val="24"/>
       <w:szCs w:val="24"/>
-      <w:lang w:val="en-US" w:eastAsia="zh-CN" w:bidi="ar-SA"/>
     </w:rPr>
   </w:style>
-  <w:style w:type="paragraph" w:styleId="8">
+  <w:style w:type="paragraph" w:styleId="7">
     <w:name w:val="heading 7"/>
-    <w:link w:val="21"/>
+    <w:link w:val="70"/>
+    <w:uiPriority w:val="9"/>
     <w:unhideWhenUsed/>
     <w:qFormat/>
-    <w:uiPriority w:val="9"/>
     <w:pPr>
       <w:keepNext/>
       <w:keepLines/>
@@ -1902,21 +2684,20 @@
       <w:outlineLvl w:val="6"/>
     </w:pPr>
     <w:rPr>
-      <w:rFonts w:ascii="Arial Unicode MS" w:hAnsi="Arial Unicode MS" w:eastAsia="宋体" w:cstheme="minorBidi"/>
+      <w:rFonts w:ascii="Arial Unicode MS" w:hAnsi="Arial Unicode MS"/>
       <w:b/>
       <w:bCs/>
       <w:kern w:val="2"/>
       <w:sz w:val="24"/>
       <w:szCs w:val="24"/>
-      <w:lang w:val="en-US" w:eastAsia="zh-CN" w:bidi="ar-SA"/>
     </w:rPr>
   </w:style>
-  <w:style w:type="paragraph" w:styleId="9">
+  <w:style w:type="paragraph" w:styleId="8">
     <w:name w:val="heading 8"/>
-    <w:link w:val="18"/>
+    <w:link w:val="80"/>
+    <w:uiPriority w:val="9"/>
     <w:unhideWhenUsed/>
     <w:qFormat/>
-    <w:uiPriority w:val="9"/>
     <w:pPr>
       <w:keepNext/>
       <w:keepLines/>
@@ -1927,20 +2708,19 @@
       <w:outlineLvl w:val="7"/>
     </w:pPr>
     <w:rPr>
-      <w:rFonts w:ascii="Arial Unicode MS" w:hAnsi="Arial Unicode MS" w:eastAsia="宋体" w:cstheme="majorBidi"/>
+      <w:rFonts w:ascii="Arial Unicode MS" w:hAnsi="Arial Unicode MS" w:cstheme="majorBidi"/>
       <w:kern w:val="2"/>
       <w:sz w:val="24"/>
       <w:szCs w:val="24"/>
-      <w:lang w:val="en-US" w:eastAsia="zh-CN" w:bidi="ar-SA"/>
     </w:rPr>
   </w:style>
-  <w:style w:type="paragraph" w:styleId="10">
+  <w:style w:type="paragraph" w:styleId="9">
     <w:name w:val="heading 9"/>
-    <w:next w:val="1"/>
-    <w:link w:val="19"/>
+    <w:next w:val="a"/>
+    <w:link w:val="90"/>
+    <w:uiPriority w:val="9"/>
     <w:unhideWhenUsed/>
     <w:qFormat/>
-    <w:uiPriority w:val="9"/>
     <w:pPr>
       <w:keepNext/>
       <w:keepLines/>
@@ -1951,26 +2731,25 @@
       <w:outlineLvl w:val="8"/>
     </w:pPr>
     <w:rPr>
-      <w:rFonts w:ascii="Times New Roman" w:hAnsi="Times New Roman" w:eastAsia="宋体" w:cstheme="majorBidi"/>
+      <w:rFonts w:cstheme="majorBidi"/>
       <w:kern w:val="2"/>
       <w:sz w:val="24"/>
       <w:szCs w:val="21"/>
-      <w:lang w:val="en-US" w:eastAsia="zh-CN" w:bidi="ar-SA"/>
     </w:rPr>
   </w:style>
-  <w:style w:type="character" w:default="1" w:styleId="12">
+  <w:style w:type="character" w:default="1" w:styleId="a0">
     <w:name w:val="Default Paragraph Font"/>
+    <w:uiPriority w:val="1"/>
     <w:semiHidden/>
     <w:unhideWhenUsed/>
-    <w:uiPriority w:val="1"/>
   </w:style>
-  <w:style w:type="table" w:default="1" w:styleId="11">
+  <w:style w:type="table" w:default="1" w:styleId="a1">
     <w:name w:val="Normal Table"/>
+    <w:uiPriority w:val="99"/>
     <w:semiHidden/>
     <w:unhideWhenUsed/>
-    <w:qFormat/>
-    <w:uiPriority w:val="99"/>
     <w:tblPr>
+      <w:tblInd w:w="0" w:type="dxa"/>
       <w:tblCellMar>
         <w:top w:w="0" w:type="dxa"/>
         <w:left w:w="108" w:type="dxa"/>
@@ -1979,14 +2758,20 @@
       </w:tblCellMar>
     </w:tblPr>
   </w:style>
-  <w:style w:type="character" w:customStyle="1" w:styleId="13">
+  <w:style w:type="numbering" w:default="1" w:styleId="a2">
+    <w:name w:val="No List"/>
+    <w:uiPriority w:val="99"/>
+    <w:semiHidden/>
+    <w:unhideWhenUsed/>
+  </w:style>
+  <w:style w:type="character" w:customStyle="1" w:styleId="10">
     <w:name w:val="标题 1 字符"/>
-    <w:basedOn w:val="12"/>
-    <w:link w:val="2"/>
+    <w:basedOn w:val="a0"/>
+    <w:link w:val="1"/>
+    <w:uiPriority w:val="9"/>
     <w:qFormat/>
-    <w:uiPriority w:val="9"/>
     <w:rPr>
-      <w:rFonts w:ascii="Arial Unicode MS" w:hAnsi="Arial Unicode MS" w:eastAsia="宋体"/>
+      <w:rFonts w:ascii="Arial Unicode MS" w:eastAsia="宋体" w:hAnsi="Arial Unicode MS"/>
       <w:b/>
       <w:bCs/>
       <w:kern w:val="44"/>
@@ -1994,23 +2779,23 @@
       <w:szCs w:val="44"/>
     </w:rPr>
   </w:style>
-  <w:style w:type="character" w:customStyle="1" w:styleId="14">
+  <w:style w:type="character" w:customStyle="1" w:styleId="20">
     <w:name w:val="标题 2 字符"/>
-    <w:basedOn w:val="12"/>
-    <w:link w:val="3"/>
+    <w:basedOn w:val="a0"/>
+    <w:link w:val="2"/>
     <w:uiPriority w:val="9"/>
     <w:rPr>
-      <w:rFonts w:ascii="Arial Unicode MS" w:hAnsi="Arial Unicode MS" w:eastAsia="宋体" w:cstheme="majorBidi"/>
+      <w:rFonts w:ascii="Arial Unicode MS" w:eastAsia="宋体" w:hAnsi="Arial Unicode MS" w:cstheme="majorBidi"/>
       <w:b/>
       <w:bCs/>
       <w:sz w:val="32"/>
       <w:szCs w:val="32"/>
     </w:rPr>
   </w:style>
-  <w:style w:type="character" w:customStyle="1" w:styleId="15">
+  <w:style w:type="character" w:customStyle="1" w:styleId="30">
     <w:name w:val="标题 3 字符"/>
-    <w:basedOn w:val="12"/>
-    <w:link w:val="4"/>
+    <w:basedOn w:val="a0"/>
+    <w:link w:val="3"/>
     <w:uiPriority w:val="9"/>
     <w:rPr>
       <w:rFonts w:ascii="Arial Unicode MS" w:hAnsi="Arial Unicode MS"/>
@@ -2020,93 +2805,93 @@
       <w:szCs w:val="32"/>
     </w:rPr>
   </w:style>
-  <w:style w:type="character" w:customStyle="1" w:styleId="16">
+  <w:style w:type="character" w:customStyle="1" w:styleId="50">
     <w:name w:val="标题 5 字符"/>
-    <w:basedOn w:val="12"/>
-    <w:link w:val="6"/>
+    <w:basedOn w:val="a0"/>
+    <w:link w:val="5"/>
+    <w:uiPriority w:val="9"/>
     <w:qFormat/>
-    <w:uiPriority w:val="9"/>
     <w:rPr>
-      <w:rFonts w:ascii="Arial Unicode MS" w:hAnsi="Arial Unicode MS" w:eastAsia="宋体"/>
+      <w:rFonts w:ascii="Arial Unicode MS" w:eastAsia="宋体" w:hAnsi="Arial Unicode MS"/>
       <w:b/>
       <w:bCs/>
       <w:sz w:val="28"/>
       <w:szCs w:val="28"/>
     </w:rPr>
   </w:style>
-  <w:style w:type="character" w:customStyle="1" w:styleId="17">
+  <w:style w:type="character" w:customStyle="1" w:styleId="60">
     <w:name w:val="标题 6 字符"/>
-    <w:basedOn w:val="12"/>
-    <w:link w:val="7"/>
+    <w:basedOn w:val="a0"/>
+    <w:link w:val="6"/>
+    <w:uiPriority w:val="9"/>
     <w:semiHidden/>
     <w:qFormat/>
-    <w:uiPriority w:val="9"/>
     <w:rPr>
-      <w:rFonts w:eastAsia="宋体" w:asciiTheme="majorHAnsi" w:hAnsiTheme="majorHAnsi" w:cstheme="majorBidi"/>
+      <w:rFonts w:asciiTheme="majorHAnsi" w:eastAsia="宋体" w:hAnsiTheme="majorHAnsi" w:cstheme="majorBidi"/>
       <w:b/>
       <w:bCs/>
       <w:sz w:val="24"/>
       <w:szCs w:val="24"/>
     </w:rPr>
   </w:style>
-  <w:style w:type="character" w:customStyle="1" w:styleId="18">
+  <w:style w:type="character" w:customStyle="1" w:styleId="80">
     <w:name w:val="标题 8 字符"/>
-    <w:basedOn w:val="12"/>
-    <w:link w:val="9"/>
+    <w:basedOn w:val="a0"/>
+    <w:link w:val="8"/>
     <w:uiPriority w:val="9"/>
     <w:rPr>
-      <w:rFonts w:ascii="Arial Unicode MS" w:hAnsi="Arial Unicode MS" w:eastAsia="宋体" w:cstheme="majorBidi"/>
+      <w:rFonts w:ascii="Arial Unicode MS" w:eastAsia="宋体" w:hAnsi="Arial Unicode MS" w:cstheme="majorBidi"/>
       <w:sz w:val="24"/>
       <w:szCs w:val="24"/>
     </w:rPr>
   </w:style>
-  <w:style w:type="character" w:customStyle="1" w:styleId="19">
+  <w:style w:type="character" w:customStyle="1" w:styleId="90">
     <w:name w:val="标题 9 字符"/>
-    <w:basedOn w:val="12"/>
-    <w:link w:val="10"/>
+    <w:basedOn w:val="a0"/>
+    <w:link w:val="9"/>
+    <w:uiPriority w:val="9"/>
     <w:qFormat/>
-    <w:uiPriority w:val="9"/>
     <w:rPr>
       <w:rFonts w:cstheme="majorBidi"/>
       <w:sz w:val="24"/>
       <w:szCs w:val="21"/>
     </w:rPr>
   </w:style>
-  <w:style w:type="character" w:customStyle="1" w:styleId="20">
+  <w:style w:type="character" w:customStyle="1" w:styleId="40">
     <w:name w:val="标题 4 字符"/>
-    <w:basedOn w:val="12"/>
-    <w:link w:val="5"/>
+    <w:basedOn w:val="a0"/>
+    <w:link w:val="4"/>
+    <w:uiPriority w:val="9"/>
     <w:qFormat/>
-    <w:uiPriority w:val="9"/>
     <w:rPr>
-      <w:rFonts w:ascii="Arial Unicode MS" w:hAnsi="Arial Unicode MS" w:eastAsia="宋体" w:cstheme="majorBidi"/>
+      <w:rFonts w:ascii="Arial Unicode MS" w:eastAsia="宋体" w:hAnsi="Arial Unicode MS" w:cstheme="majorBidi"/>
       <w:b/>
       <w:bCs/>
       <w:sz w:val="28"/>
       <w:szCs w:val="28"/>
     </w:rPr>
   </w:style>
-  <w:style w:type="character" w:customStyle="1" w:styleId="21">
+  <w:style w:type="character" w:customStyle="1" w:styleId="70">
     <w:name w:val="标题 7 字符"/>
-    <w:basedOn w:val="12"/>
-    <w:link w:val="8"/>
+    <w:basedOn w:val="a0"/>
+    <w:link w:val="7"/>
+    <w:uiPriority w:val="9"/>
     <w:qFormat/>
-    <w:uiPriority w:val="9"/>
     <w:rPr>
-      <w:rFonts w:ascii="Arial Unicode MS" w:hAnsi="Arial Unicode MS" w:eastAsia="宋体"/>
+      <w:rFonts w:ascii="Arial Unicode MS" w:eastAsia="宋体" w:hAnsi="Arial Unicode MS"/>
       <w:b/>
       <w:bCs/>
       <w:sz w:val="24"/>
       <w:szCs w:val="24"/>
     </w:rPr>
   </w:style>
-  <w:style w:type="paragraph" w:styleId="22">
+  <w:style w:type="paragraph" w:styleId="a3">
     <w:name w:val="List Paragraph"/>
-    <w:basedOn w:val="1"/>
+    <w:basedOn w:val="a"/>
+    <w:uiPriority w:val="34"/>
     <w:qFormat/>
-    <w:uiPriority w:val="34"/>
     <w:pPr>
-      <w:ind w:firstLine="420" w:firstLineChars="200"/>
+      <w:ind w:firstLineChars="200" w:firstLine="420"/>
     </w:pPr>
   </w:style>
 </w:styles>
@@ -2364,5 +3149,6 @@
     </a:fmtScheme>
   </a:themeElements>
   <a:objectDefaults/>
+  <a:extraClrSchemeLst/>
 </a:theme>
 </file>
</xml_diff>